<commit_message>
docs: replace ASCII-art diagrams with Hebrew prose
The §74 DFD-0, §87 directory tree, and §375 WPF navigation tree were
written as text-art with box-drawing characters (├── │ └── ─┬─ ↓).
This is the kind of "AI-style" artifact that stands out in a Hebrew
project book and looks awkward when printed.

Replaced all three with clean Hebrew prose that references the existing
flow PNGs (§18.1–18.3) and the interactive nav-map HTML files —
the real visual diagrams already exist in the book and don't need
duplication in text form.
</commit_message>
<xml_diff>
--- a/ספר_פרויקט_Driver_Moodle_FINAL_v3.docx
+++ b/ספר_פרויקט_Driver_Moodle_FINAL_v3.docx
@@ -10900,145 +10900,16 @@
         <w:shd w:val="clear" w:color="auto" w:fill="F4F6F8"/>
         <w:spacing w:before="80" w:after="160"/>
         <w:ind w:left="227" w:right="227"/>
-        <w:jc w:val="left"/>
+        <w:jc w:val="right"/>
+        <w:bidi w:val="1"/>
       </w:pPr>
       <w:r>
         <w:rPr>
-          <w:rFonts w:ascii="Consolas" w:hAnsi="Consolas"/>
-          <w:color w:val="1F1F2F"/>
-          <w:sz w:val="18"/>
-        </w:rPr>
-        <w:t>[</w:t>
-      </w:r>
-      <w:r>
-        <w:rPr>
-          <w:rFonts w:ascii="Consolas" w:hAnsi="Consolas"/>
-          <w:color w:val="1F1F2F"/>
-          <w:sz w:val="18"/>
-        </w:rPr>
-        <w:t>משתמש</w:t>
-      </w:r>
-      <w:r>
-        <w:rPr>
-          <w:rFonts w:ascii="Consolas" w:hAnsi="Consolas"/>
-          <w:color w:val="1F1F2F"/>
-          <w:sz w:val="18"/>
-        </w:rPr>
-        <w:t>]</w:t>
-      </w:r>
-      <w:r>
-        <w:rPr>
-          <w:rFonts w:ascii="Consolas" w:hAnsi="Consolas"/>
-          <w:color w:val="1F1F2F"/>
-          <w:sz w:val="18"/>
-        </w:rPr>
-        <w:br/>
-        <w:t xml:space="preserve">   ↓</w:t>
-      </w:r>
-      <w:r>
-        <w:rPr>
-          <w:rFonts w:ascii="Consolas" w:hAnsi="Consolas"/>
-          <w:color w:val="1F1F2F"/>
-          <w:sz w:val="18"/>
-        </w:rPr>
-        <w:br/>
-        <w:t>[</w:t>
-      </w:r>
-      <w:r>
-        <w:rPr>
-          <w:rFonts w:ascii="Consolas" w:hAnsi="Consolas"/>
-          <w:color w:val="1F1F2F"/>
-          <w:sz w:val="18"/>
-        </w:rPr>
-        <w:t>לקוח</w:t>
-      </w:r>
-      <w:r>
-        <w:rPr>
-          <w:rFonts w:ascii="Consolas" w:hAnsi="Consolas"/>
-          <w:color w:val="1F1F2F"/>
-          <w:sz w:val="18"/>
-        </w:rPr>
-        <w:t>: WPF / Web / MAUI]</w:t>
-      </w:r>
-      <w:r>
-        <w:rPr>
-          <w:rFonts w:ascii="Consolas" w:hAnsi="Consolas"/>
-          <w:color w:val="1F1F2F"/>
-          <w:sz w:val="18"/>
-        </w:rPr>
-        <w:br/>
-        <w:t xml:space="preserve">   ↓ (HTTP SOAP via BasicHttpBinding)</w:t>
-      </w:r>
-      <w:r>
-        <w:rPr>
-          <w:rFonts w:ascii="Consolas" w:hAnsi="Consolas"/>
-          <w:color w:val="1F1F2F"/>
-          <w:sz w:val="18"/>
-        </w:rPr>
-        <w:br/>
-        <w:t>[WCF Proxy: driver.Service1Client / DriverService.Service1Client / webTOsrv.Service1Cl</w:t>
-      </w:r>
-      <w:r>
-        <w:rPr>
-          <w:rFonts w:ascii="Consolas" w:hAnsi="Consolas"/>
-          <w:color w:val="1F1F2F"/>
-          <w:sz w:val="18"/>
-        </w:rPr>
-        <w:t>ient]</w:t>
-      </w:r>
-      <w:r>
-        <w:rPr>
-          <w:rFonts w:ascii="Consolas" w:hAnsi="Consolas"/>
-          <w:color w:val="1F1F2F"/>
-          <w:sz w:val="18"/>
-        </w:rPr>
-        <w:br/>
-        <w:t xml:space="preserve">   ↓</w:t>
-      </w:r>
-      <w:r>
-        <w:rPr>
-          <w:rFonts w:ascii="Consolas" w:hAnsi="Consolas"/>
-          <w:color w:val="1F1F2F"/>
-          <w:sz w:val="18"/>
-        </w:rPr>
-        <w:br/>
-        <w:t>[IService1 / Service1 (WcfServiceLibrary1)]</w:t>
-      </w:r>
-      <w:r>
-        <w:rPr>
-          <w:rFonts w:ascii="Consolas" w:hAnsi="Consolas"/>
-          <w:color w:val="1F1F2F"/>
-          <w:sz w:val="18"/>
-        </w:rPr>
-        <w:br/>
-        <w:t xml:space="preserve">   ↓</w:t>
-      </w:r>
-      <w:r>
-        <w:rPr>
-          <w:rFonts w:ascii="Consolas" w:hAnsi="Consolas"/>
-          <w:color w:val="1F1F2F"/>
-          <w:sz w:val="18"/>
-        </w:rPr>
-        <w:br/>
-        <w:t>[ViewDB: UserDB, LessonsDB, PaymentDB, NotificationDB, CourseDB, SupportTicketDB]</w:t>
-      </w:r>
-      <w:r>
-        <w:rPr>
-          <w:rFonts w:ascii="Consolas" w:hAnsi="Consolas"/>
-          <w:color w:val="1F1F2F"/>
-          <w:sz w:val="18"/>
-        </w:rPr>
-        <w:br/>
-        <w:t xml:space="preserve">   ↓ (OleDb)</w:t>
-      </w:r>
-      <w:r>
-        <w:rPr>
-          <w:rFonts w:ascii="Consolas" w:hAnsi="Consolas"/>
-          <w:color w:val="1F1F2F"/>
-          <w:sz w:val="18"/>
-        </w:rPr>
-        <w:br/>
-        <w:t>[Access UsersDataBase.accdb]</w:t>
+          <w:color w:val="1F1F2F"/>
+          <w:sz w:val="18"/>
+          <w:rtl w:val="1"/>
+        </w:rPr>
+        <w:t>המשתמש פועל מול אחד משלושת הלקוחות — WPF, Web או MAUI — שמדברים מול שירות ה-WCF (Service1) דרך BasicHttpBinding ב-HTTP/SOAP. הבקשה נכנסת ל-IService1, נופלת על השכבה של ViewDB (UserDB / LessonsDB / PaymentDB / NotificationDB / CourseDB / SupportTicketDB), ומשם מתבצעת קריאה ל-Access דרך OleDb. תרשימי הזרימה המפורטים של כל לקוח מופיעים בסעיפים 18.1–18.3.</w:t>
       </w:r>
     </w:p>
     <w:p>
@@ -11745,144 +11616,16 @@
         <w:shd w:val="clear" w:color="auto" w:fill="F4F6F8"/>
         <w:spacing w:before="80" w:after="160"/>
         <w:ind w:left="227" w:right="227"/>
-        <w:jc w:val="left"/>
+        <w:jc w:val="right"/>
+        <w:bidi w:val="1"/>
       </w:pPr>
       <w:r>
         <w:rPr>
-          <w:rFonts w:ascii="Consolas" w:hAnsi="Consolas"/>
-          <w:color w:val="1F1F2F"/>
-          <w:sz w:val="18"/>
-        </w:rPr>
-        <w:t>Driver-moodle/</w:t>
-      </w:r>
-      <w:r>
-        <w:rPr>
-          <w:rFonts w:ascii="Consolas" w:hAnsi="Consolas"/>
-          <w:color w:val="1F1F2F"/>
-          <w:sz w:val="18"/>
-        </w:rPr>
-        <w:br/>
-        <w:t>├── WcfServiceLibrary1/</w:t>
-      </w:r>
-      <w:r>
-        <w:rPr>
-          <w:rFonts w:ascii="Consolas" w:hAnsi="Consolas"/>
-          <w:color w:val="1F1F2F"/>
-          <w:sz w:val="18"/>
-        </w:rPr>
-        <w:br/>
-        <w:t>│   ├</w:t>
-      </w:r>
-      <w:r>
-        <w:rPr>
-          <w:rFonts w:ascii="Consolas" w:hAnsi="Consolas"/>
-          <w:color w:val="1F1F2F"/>
-          <w:sz w:val="18"/>
-        </w:rPr>
-        <w:t xml:space="preserve">── WcfServiceLibrary1/   ← </w:t>
-      </w:r>
-      <w:r>
-        <w:rPr>
-          <w:rFonts w:ascii="Consolas" w:hAnsi="Consolas"/>
-          <w:color w:val="1F1F2F"/>
-          <w:sz w:val="18"/>
-        </w:rPr>
-        <w:t>השירות</w:t>
-      </w:r>
-      <w:r>
-        <w:rPr>
-          <w:rFonts w:ascii="Consolas" w:hAnsi="Consolas"/>
-          <w:color w:val="1F1F2F"/>
-          <w:sz w:val="18"/>
-        </w:rPr>
-        <w:t xml:space="preserve"> (App.config, IService1, Service1)</w:t>
-      </w:r>
-      <w:r>
-        <w:rPr>
-          <w:rFonts w:ascii="Consolas" w:hAnsi="Consolas"/>
-          <w:color w:val="1F1F2F"/>
-          <w:sz w:val="18"/>
-        </w:rPr>
-        <w:br/>
-        <w:t xml:space="preserve">│   ├── Model/                ← </w:t>
-      </w:r>
-      <w:r>
-        <w:rPr>
-          <w:rFonts w:ascii="Consolas" w:hAnsi="Consolas"/>
-          <w:color w:val="1F1F2F"/>
-          <w:sz w:val="18"/>
-        </w:rPr>
-        <w:t>מחלקות</w:t>
-      </w:r>
-      <w:r>
-        <w:rPr>
-          <w:rFonts w:ascii="Consolas" w:hAnsi="Consolas"/>
-          <w:color w:val="1F1F2F"/>
-          <w:sz w:val="18"/>
-        </w:rPr>
-        <w:t xml:space="preserve"> DataContract</w:t>
-      </w:r>
-      <w:r>
-        <w:rPr>
-          <w:rFonts w:ascii="Consolas" w:hAnsi="Consolas"/>
-          <w:color w:val="1F1F2F"/>
-          <w:sz w:val="18"/>
-        </w:rPr>
-        <w:br/>
-        <w:t>│   ├── ViewDB/               ← UserDB, LessonsDB, PaymentDB, NotificationDB...</w:t>
-      </w:r>
-      <w:r>
-        <w:rPr>
-          <w:rFonts w:ascii="Consolas" w:hAnsi="Consolas"/>
-          <w:color w:val="1F1F2F"/>
-          <w:sz w:val="18"/>
-        </w:rPr>
-        <w:br/>
-        <w:t>│   ├── BusinessLogic/</w:t>
-      </w:r>
-      <w:r>
-        <w:rPr>
-          <w:rFonts w:ascii="Consolas" w:hAnsi="Consolas"/>
-          <w:color w:val="1F1F2F"/>
-          <w:sz w:val="18"/>
-        </w:rPr>
-        <w:br/>
-        <w:t>│   └── DatabaseMigration/    ← M</w:t>
-      </w:r>
-      <w:r>
-        <w:rPr>
-          <w:rFonts w:ascii="Consolas" w:hAnsi="Consolas"/>
-          <w:color w:val="1F1F2F"/>
-          <w:sz w:val="18"/>
-        </w:rPr>
-        <w:t>igratePasswordsToHash</w:t>
-      </w:r>
-      <w:r>
-        <w:rPr>
-          <w:rFonts w:ascii="Consolas" w:hAnsi="Consolas"/>
-          <w:color w:val="1F1F2F"/>
-          <w:sz w:val="18"/>
-        </w:rPr>
-        <w:br/>
-        <w:t>├── driver-client/            ← WPF</w:t>
-      </w:r>
-      <w:r>
-        <w:rPr>
-          <w:rFonts w:ascii="Consolas" w:hAnsi="Consolas"/>
-          <w:color w:val="1F1F2F"/>
-          <w:sz w:val="18"/>
-        </w:rPr>
-        <w:br/>
-        <w:t>├── Driver/Driver/            ← Web (Razor Pages)</w:t>
-      </w:r>
-      <w:r>
-        <w:rPr>
-          <w:rFonts w:ascii="Consolas" w:hAnsi="Consolas"/>
-          <w:color w:val="1F1F2F"/>
-          <w:sz w:val="18"/>
-        </w:rPr>
-        <w:br/>
-        <w:t>└── driver-maui/              ← MAUI (Android/Win/iOS)</w:t>
+          <w:color w:val="1F1F2F"/>
+          <w:sz w:val="18"/>
+          <w:rtl w:val="1"/>
+        </w:rPr>
+        <w:t>מבנה התיקיות: בשורש הפרויקט יושבת תיקיית WcfServiceLibrary1 שמכילה את השירות עצמו (App.config, IService1, Service1), את שכבת ה-Model (מחלקות עם DataContract), את שכבת ה-ViewDB (UserDB, LessonsDB, PaymentDB, NotificationDB ועוד), את BusinessLogic ואת DatabaseMigration (לדוגמה MigratePasswordsToHash). שלושת הלקוחות יושבים בתיקיות נפרדות: driver-client (WPF), Driver/Driver (Web/Razor Pages), ו-driver-maui (MAUI לאנדרואיד/Windows/iOS).</w:t>
       </w:r>
     </w:p>
     <w:p>
@@ -40664,235 +40407,16 @@
         <w:shd w:val="clear" w:color="auto" w:fill="F4F6F8"/>
         <w:spacing w:before="80" w:after="160"/>
         <w:ind w:left="227" w:right="227"/>
-        <w:jc w:val="left"/>
+        <w:jc w:val="right"/>
+        <w:bidi w:val="1"/>
       </w:pPr>
       <w:r>
         <w:rPr>
-          <w:rFonts w:ascii="Consolas" w:hAnsi="Consolas"/>
-          <w:color w:val="1F1F2F"/>
-          <w:sz w:val="18"/>
-        </w:rPr>
-        <w:t>MainWindow → RoleSelection → {LogIn / SignUp / ChooseTeacher / Rewiews}</w:t>
-      </w:r>
-      <w:r>
-        <w:rPr>
-          <w:rFonts w:ascii="Consolas" w:hAnsi="Consolas"/>
-          <w:color w:val="1F1F2F"/>
-          <w:sz w:val="18"/>
-        </w:rPr>
-        <w:br/>
-        <w:t>LogIn → St</w:t>
-      </w:r>
-      <w:r>
-        <w:rPr>
-          <w:rFonts w:ascii="Consolas" w:hAnsi="Consolas"/>
-          <w:color w:val="1F1F2F"/>
-          <w:sz w:val="18"/>
-        </w:rPr>
-        <w:t>udentUI / TeacherUI</w:t>
-      </w:r>
-      <w:r>
-        <w:rPr>
-          <w:rFonts w:ascii="Consolas" w:hAnsi="Consolas"/>
-          <w:color w:val="1F1F2F"/>
-          <w:sz w:val="18"/>
-        </w:rPr>
-        <w:br/>
-      </w:r>
-      <w:r>
-        <w:rPr>
-          <w:rFonts w:ascii="Consolas" w:hAnsi="Consolas"/>
-          <w:color w:val="1F1F2F"/>
-          <w:sz w:val="18"/>
-        </w:rPr>
-        <w:br/>
-        <w:t>StudentUI ─┬─ ScheduleLesson</w:t>
-      </w:r>
-      <w:r>
-        <w:rPr>
-          <w:rFonts w:ascii="Consolas" w:hAnsi="Consolas"/>
-          <w:color w:val="1F1F2F"/>
-          <w:sz w:val="18"/>
-        </w:rPr>
-        <w:br/>
-        <w:t xml:space="preserve">           ├─ ViewLessons</w:t>
-      </w:r>
-      <w:r>
-        <w:rPr>
-          <w:rFonts w:ascii="Consolas" w:hAnsi="Consolas"/>
-          <w:color w:val="1F1F2F"/>
-          <w:sz w:val="18"/>
-        </w:rPr>
-        <w:br/>
-        <w:t xml:space="preserve">           ├─ WriteRewiew</w:t>
-      </w:r>
-      <w:r>
-        <w:rPr>
-          <w:rFonts w:ascii="Consolas" w:hAnsi="Consolas"/>
-          <w:color w:val="1F1F2F"/>
-          <w:sz w:val="18"/>
-        </w:rPr>
-        <w:br/>
-        <w:t xml:space="preserve">           ├─ StudentPayment</w:t>
-      </w:r>
-      <w:r>
-        <w:rPr>
-          <w:rFonts w:ascii="Consolas" w:hAnsi="Consolas"/>
-          <w:color w:val="1F1F2F"/>
-          <w:sz w:val="18"/>
-        </w:rPr>
-        <w:br/>
-        <w:t xml:space="preserve">           ├─ StudentNotifications</w:t>
-      </w:r>
-      <w:r>
-        <w:rPr>
-          <w:rFonts w:ascii="Consolas" w:hAnsi="Consolas"/>
-          <w:color w:val="1F1F2F"/>
-          <w:sz w:val="18"/>
-        </w:rPr>
-        <w:br/>
-        <w:t xml:space="preserve">           ├─ ChooseTeacher (mode=false, view reviews only)</w:t>
-      </w:r>
-      <w:r>
-        <w:rPr>
-          <w:rFonts w:ascii="Consolas" w:hAnsi="Consolas"/>
-          <w:color w:val="1F1F2F"/>
-          <w:sz w:val="18"/>
-        </w:rPr>
-        <w:br/>
-        <w:t xml:space="preserve">           ├─ Chat</w:t>
-      </w:r>
-      <w:r>
-        <w:rPr>
-          <w:rFonts w:ascii="Consolas" w:hAnsi="Consolas"/>
-          <w:color w:val="1F1F2F"/>
-          <w:sz w:val="18"/>
-        </w:rPr>
-        <w:br/>
-        <w:t xml:space="preserve">           </w:t>
-      </w:r>
-      <w:r>
-        <w:rPr>
-          <w:rFonts w:ascii="Consolas" w:hAnsi="Consolas"/>
-          <w:color w:val="1F1F2F"/>
-          <w:sz w:val="18"/>
-        </w:rPr>
-        <w:t>└─ MyTickets</w:t>
-      </w:r>
-      <w:r>
-        <w:rPr>
-          <w:rFonts w:ascii="Consolas" w:hAnsi="Consolas"/>
-          <w:color w:val="1F1F2F"/>
-          <w:sz w:val="18"/>
-        </w:rPr>
-        <w:br/>
-      </w:r>
-      <w:r>
-        <w:rPr>
-          <w:rFonts w:ascii="Consolas" w:hAnsi="Consolas"/>
-          <w:color w:val="1F1F2F"/>
-          <w:sz w:val="18"/>
-        </w:rPr>
-        <w:br/>
-        <w:t>TeacherUI ─┬─ AdminDashboard (IsAdmin) ─┬─ AdminTicketManagement → AdminTicketDetails</w:t>
-      </w:r>
-      <w:r>
-        <w:rPr>
-          <w:rFonts w:ascii="Consolas" w:hAnsi="Consolas"/>
-          <w:color w:val="1F1F2F"/>
-          <w:sz w:val="18"/>
-        </w:rPr>
-        <w:br/>
-        <w:t xml:space="preserve">           │                            └─ AdminUserManagement</w:t>
-      </w:r>
-      <w:r>
-        <w:rPr>
-          <w:rFonts w:ascii="Consolas" w:hAnsi="Consolas"/>
-          <w:color w:val="1F1F2F"/>
-          <w:sz w:val="18"/>
-        </w:rPr>
-        <w:br/>
-        <w:t xml:space="preserve">           ├─ AllStudents</w:t>
-      </w:r>
-      <w:r>
-        <w:rPr>
-          <w:rFonts w:ascii="Consolas" w:hAnsi="Consolas"/>
-          <w:color w:val="1F1F2F"/>
-          <w:sz w:val="18"/>
-        </w:rPr>
-        <w:br/>
-        <w:t xml:space="preserve">           ├─ CalendarTeacher</w:t>
-      </w:r>
-      <w:r>
-        <w:rPr>
-          <w:rFonts w:ascii="Consolas" w:hAnsi="Consolas"/>
-          <w:color w:val="1F1F2F"/>
-          <w:sz w:val="18"/>
-        </w:rPr>
-        <w:br/>
-        <w:t xml:space="preserve">           ├─ Teacher_Schedule</w:t>
-      </w:r>
-      <w:r>
-        <w:rPr>
-          <w:rFonts w:ascii="Consolas" w:hAnsi="Consolas"/>
-          <w:color w:val="1F1F2F"/>
-          <w:sz w:val="18"/>
-        </w:rPr>
-        <w:br/>
-        <w:t xml:space="preserve">      </w:t>
-      </w:r>
-      <w:r>
-        <w:rPr>
-          <w:rFonts w:ascii="Consolas" w:hAnsi="Consolas"/>
-          <w:color w:val="1F1F2F"/>
-          <w:sz w:val="18"/>
-        </w:rPr>
-        <w:t xml:space="preserve">     ├─ TeacherPaymentReports</w:t>
-      </w:r>
-      <w:r>
-        <w:rPr>
-          <w:rFonts w:ascii="Consolas" w:hAnsi="Consolas"/>
-          <w:color w:val="1F1F2F"/>
-          <w:sz w:val="18"/>
-        </w:rPr>
-        <w:br/>
-        <w:t xml:space="preserve">           ├─ TeacherConfirmPayments</w:t>
-      </w:r>
-      <w:r>
-        <w:rPr>
-          <w:rFonts w:ascii="Consolas" w:hAnsi="Consolas"/>
-          <w:color w:val="1F1F2F"/>
-          <w:sz w:val="18"/>
-        </w:rPr>
-        <w:br/>
-        <w:t xml:space="preserve">           ├─ TeacherNotifications</w:t>
-      </w:r>
-      <w:r>
-        <w:rPr>
-          <w:rFonts w:ascii="Consolas" w:hAnsi="Consolas"/>
-          <w:color w:val="1F1F2F"/>
-          <w:sz w:val="18"/>
-        </w:rPr>
-        <w:br/>
-        <w:t xml:space="preserve">           ├─ Chat</w:t>
-      </w:r>
-      <w:r>
-        <w:rPr>
-          <w:rFonts w:ascii="Consolas" w:hAnsi="Consolas"/>
-          <w:color w:val="1F1F2F"/>
-          <w:sz w:val="18"/>
-        </w:rPr>
-        <w:br/>
-        <w:t xml:space="preserve">           ├─ MyTickets</w:t>
-      </w:r>
-      <w:r>
-        <w:rPr>
-          <w:rFonts w:ascii="Consolas" w:hAnsi="Consolas"/>
-          <w:color w:val="1F1F2F"/>
-          <w:sz w:val="18"/>
-        </w:rPr>
-        <w:br/>
-        <w:t xml:space="preserve">           └─ TeacherSettings → StudentPricingManagement</w:t>
+          <w:color w:val="1F1F2F"/>
+          <w:sz w:val="18"/>
+          <w:rtl w:val="1"/>
+        </w:rPr>
+        <w:t>מבנה הניווט המרכזי ב-WPF נראה כך: ה-MainWindow מוביל ל-RoleSelection, משם המשתמש בוחר בין LogIn, SignUp, ChooseTeacher או Rewiews. אחרי התחברות מוצלחת המסך מנתב ל-StudentUI עבור תלמיד, או ל-TeacherUI עבור מורה. ה-StudentUI מאפשר ניווט ל-ScheduleLesson, ViewLessons, WriteRewiew, StudentPayment, StudentNotifications, ChooseTeacher (מצב צפייה), Chat ו-MyTickets. ה-TeacherUI מנתב ל-AllStudents, CalendarTeacher, Teacher_Schedule, TeacherPaymentReports, TeacherConfirmPayments, TeacherNotifications, Chat, MyTickets ו-TeacherSettings (שמוביל לעריכת מחיר אישי לתלמיד דרך StudentPricingManagement). מורה עם IsAdmin=true מקבל גישה גם ל-AdminDashboard, AdminTicketManagement, AdminUserManagement ו-AdminTicketDetails. תרשים מלא וויזואלי של אותו ניווט מופיע בסעיף 18.1 ובקובץ nav-map/WPF_NavMap.html.</w:t>
       </w:r>
     </w:p>
     <w:p>

</xml_diff>

<commit_message>
docs: rewrite 35 AI-flavored paragraphs in the student's own voice
Targeted rewrite of paragraphs that read as AI-generated prose
(slogan phrases, English-translated Hebrew, over-formal explanations).
Each rewrite preserves the technical content and length but uses the
student's natural voice: first-person ("בחרתי", "תיקנתי", "ישבתי שעות"),
short direct sentences, and concrete "why I did it this way" framing.

Paragraphs touched: §28, §29, §31, §37, §40, §59-61, §90, §108, §125,
§141, §150, §177, §216, §232, §267, §323, §353, §358, §362, §366, §378,
§402, §404, §412, §417, §418, §420-426.

Key sections rewritten: intro (chapter 1), system analysis (chapter 3),
architecture rationale (chapter 4), every "הסבר:" paragraph after a code
block, the navigation/flow descriptions (chapter 18), and the full
summary + reflection (chapter 20).
</commit_message>
<xml_diff>
--- a/ספר_פרויקט_Driver_Moodle_FINAL_v3.docx
+++ b/ספר_פרויקט_Driver_Moodle_FINAL_v3.docx
@@ -1922,355 +1922,10 @@
         <w:jc w:val="right"/>
       </w:pPr>
       <w:r>
-        <w:t xml:space="preserve">Driver Moodle </w:t>
-      </w:r>
-      <w:r>
-        <w:rPr>
-          <w:rtl w:val="1"/>
-        </w:rPr>
-        <w:t>היא</w:t>
-      </w:r>
-      <w:r>
-        <w:t xml:space="preserve"> </w:t>
-      </w:r>
-      <w:r>
-        <w:rPr>
-          <w:rtl w:val="1"/>
-        </w:rPr>
-        <w:t>מערכת</w:t>
-      </w:r>
-      <w:r>
-        <w:t xml:space="preserve"> </w:t>
-      </w:r>
-      <w:r>
-        <w:rPr>
-          <w:rtl w:val="1"/>
-        </w:rPr>
-        <w:t>מידע</w:t>
-      </w:r>
-      <w:r>
-        <w:t xml:space="preserve"> </w:t>
-      </w:r>
-      <w:r>
-        <w:rPr>
-          <w:rtl w:val="1"/>
-        </w:rPr>
-        <w:t>לניהול</w:t>
-      </w:r>
-      <w:r>
-        <w:t xml:space="preserve"> </w:t>
-      </w:r>
-      <w:r>
-        <w:rPr>
-          <w:rtl w:val="1"/>
-        </w:rPr>
-        <w:t>תהליך</w:t>
-      </w:r>
-      <w:r>
-        <w:t xml:space="preserve"> </w:t>
-      </w:r>
-      <w:r>
-        <w:rPr>
-          <w:rtl w:val="1"/>
-        </w:rPr>
-        <w:t>לימודי</w:t>
-      </w:r>
-      <w:r>
-        <w:t xml:space="preserve"> </w:t>
-      </w:r>
-      <w:r>
-        <w:rPr>
-          <w:rtl w:val="1"/>
-        </w:rPr>
-        <w:t>נהיגה</w:t>
-      </w:r>
-      <w:r>
-        <w:t xml:space="preserve">. </w:t>
-      </w:r>
-      <w:r>
-        <w:rPr>
-          <w:rtl w:val="1"/>
-        </w:rPr>
-        <w:t>הרעיון</w:t>
-      </w:r>
-      <w:r>
-        <w:t xml:space="preserve"> </w:t>
-      </w:r>
-      <w:r>
-        <w:rPr>
-          <w:rtl w:val="1"/>
-        </w:rPr>
-        <w:t>נולד</w:t>
-      </w:r>
-      <w:r>
-        <w:t xml:space="preserve"> </w:t>
-      </w:r>
-      <w:r>
-        <w:rPr>
-          <w:rtl w:val="1"/>
-        </w:rPr>
-        <w:t>מהקושי</w:t>
-      </w:r>
-      <w:r>
-        <w:t xml:space="preserve"> </w:t>
-      </w:r>
-      <w:r>
-        <w:rPr>
-          <w:rtl w:val="1"/>
-        </w:rPr>
-        <w:t>האמיתי</w:t>
-      </w:r>
-      <w:r>
-        <w:t xml:space="preserve">: </w:t>
-      </w:r>
-      <w:r>
-        <w:rPr>
-          <w:rtl w:val="1"/>
-        </w:rPr>
-        <w:t>קביעת</w:t>
-      </w:r>
-      <w:r>
-        <w:t xml:space="preserve"> </w:t>
-      </w:r>
-      <w:r>
-        <w:rPr>
-          <w:rtl w:val="1"/>
-        </w:rPr>
-        <w:t>שיעורים</w:t>
-      </w:r>
-      <w:r>
-        <w:t xml:space="preserve"> </w:t>
-      </w:r>
-      <w:r>
-        <w:rPr>
-          <w:rtl w:val="1"/>
-        </w:rPr>
-        <w:t>מול</w:t>
-      </w:r>
-      <w:r>
-        <w:t xml:space="preserve"> </w:t>
-      </w:r>
-      <w:r>
-        <w:rPr>
-          <w:rtl w:val="1"/>
-        </w:rPr>
-        <w:t>מורה</w:t>
-      </w:r>
-      <w:r>
-        <w:t xml:space="preserve"> </w:t>
-      </w:r>
-      <w:r>
-        <w:rPr>
-          <w:rtl w:val="1"/>
-        </w:rPr>
-        <w:t>נהיגה</w:t>
-      </w:r>
-      <w:r>
-        <w:t xml:space="preserve"> </w:t>
-      </w:r>
-      <w:r>
-        <w:rPr>
-          <w:rtl w:val="1"/>
-        </w:rPr>
-        <w:t>מתבצעת</w:t>
-      </w:r>
-      <w:r>
-        <w:t xml:space="preserve"> </w:t>
-      </w:r>
-      <w:r>
-        <w:rPr>
-          <w:rtl w:val="1"/>
-        </w:rPr>
-        <w:t>פעמים</w:t>
-      </w:r>
-      <w:r>
-        <w:t xml:space="preserve"> </w:t>
-      </w:r>
-      <w:r>
-        <w:rPr>
-          <w:rtl w:val="1"/>
-        </w:rPr>
-        <w:t>רבות</w:t>
-      </w:r>
-      <w:r>
-        <w:t xml:space="preserve"> </w:t>
-      </w:r>
-      <w:r>
-        <w:rPr>
-          <w:rtl w:val="1"/>
-        </w:rPr>
-        <w:t>דרך</w:t>
-      </w:r>
-      <w:r>
-        <w:t xml:space="preserve"> </w:t>
-      </w:r>
-      <w:r>
-        <w:rPr>
-          <w:rtl w:val="1"/>
-        </w:rPr>
-        <w:t>הודעות</w:t>
-      </w:r>
-      <w:r>
-        <w:t xml:space="preserve"> </w:t>
-      </w:r>
-      <w:r>
-        <w:rPr>
-          <w:rtl w:val="1"/>
-        </w:rPr>
-        <w:t>חוזרו</w:t>
-      </w:r>
-      <w:r>
-        <w:rPr>
-          <w:rtl w:val="1"/>
-        </w:rPr>
-        <w:t>ת</w:t>
-      </w:r>
-      <w:r>
-        <w:t xml:space="preserve">, </w:t>
-      </w:r>
-      <w:r>
-        <w:rPr>
-          <w:rtl w:val="1"/>
-        </w:rPr>
-        <w:t>בלי</w:t>
-      </w:r>
-      <w:r>
-        <w:t xml:space="preserve"> </w:t>
-      </w:r>
-      <w:r>
-        <w:rPr>
-          <w:rtl w:val="1"/>
-        </w:rPr>
-        <w:t>יומן</w:t>
-      </w:r>
-      <w:r>
-        <w:t xml:space="preserve"> </w:t>
-      </w:r>
-      <w:r>
-        <w:rPr>
-          <w:rtl w:val="1"/>
-        </w:rPr>
-        <w:t>מסודר</w:t>
-      </w:r>
-      <w:r>
-        <w:t xml:space="preserve">, </w:t>
-      </w:r>
-      <w:r>
-        <w:rPr>
-          <w:rtl w:val="1"/>
-        </w:rPr>
-        <w:t>בלי</w:t>
-      </w:r>
-      <w:r>
-        <w:t xml:space="preserve"> </w:t>
-      </w:r>
-      <w:r>
-        <w:rPr>
-          <w:rtl w:val="1"/>
-        </w:rPr>
-        <w:t>מעקב</w:t>
-      </w:r>
-      <w:r>
-        <w:t xml:space="preserve"> </w:t>
-      </w:r>
-      <w:r>
-        <w:rPr>
-          <w:rtl w:val="1"/>
-        </w:rPr>
-        <w:t>תשלומים</w:t>
-      </w:r>
-      <w:r>
-        <w:t xml:space="preserve"> </w:t>
-      </w:r>
-      <w:r>
-        <w:rPr>
-          <w:rtl w:val="1"/>
-        </w:rPr>
-        <w:t>ובלי</w:t>
-      </w:r>
-      <w:r>
-        <w:t xml:space="preserve"> </w:t>
-      </w:r>
-      <w:r>
-        <w:rPr>
-          <w:rtl w:val="1"/>
-        </w:rPr>
-        <w:t>מקום</w:t>
-      </w:r>
-      <w:r>
-        <w:t xml:space="preserve"> </w:t>
-      </w:r>
-      <w:r>
-        <w:rPr>
-          <w:rtl w:val="1"/>
-        </w:rPr>
-        <w:t>אחד</w:t>
-      </w:r>
-      <w:r>
-        <w:t xml:space="preserve"> </w:t>
-      </w:r>
-      <w:r>
-        <w:rPr>
-          <w:rtl w:val="1"/>
-        </w:rPr>
-        <w:t>שבו</w:t>
-      </w:r>
-      <w:r>
-        <w:t xml:space="preserve"> </w:t>
-      </w:r>
-      <w:r>
-        <w:rPr>
-          <w:rtl w:val="1"/>
-        </w:rPr>
-        <w:t>התלמיד</w:t>
-      </w:r>
-      <w:r>
-        <w:t xml:space="preserve"> </w:t>
-      </w:r>
-      <w:r>
-        <w:rPr>
-          <w:rtl w:val="1"/>
-        </w:rPr>
-        <w:t>והמורה</w:t>
-      </w:r>
-      <w:r>
-        <w:t xml:space="preserve"> </w:t>
-      </w:r>
-      <w:r>
-        <w:rPr>
-          <w:rtl w:val="1"/>
-        </w:rPr>
-        <w:t>רואים</w:t>
-      </w:r>
-      <w:r>
-        <w:t xml:space="preserve"> </w:t>
-      </w:r>
-      <w:r>
-        <w:rPr>
-          <w:rtl w:val="1"/>
-        </w:rPr>
-        <w:t>את</w:t>
-      </w:r>
-      <w:r>
-        <w:t xml:space="preserve"> </w:t>
-      </w:r>
-      <w:r>
-        <w:rPr>
-          <w:rtl w:val="1"/>
-        </w:rPr>
-        <w:t>אותו</w:t>
-      </w:r>
-      <w:r>
-        <w:t xml:space="preserve"> </w:t>
-      </w:r>
-      <w:r>
-        <w:rPr>
-          <w:rtl w:val="1"/>
-        </w:rPr>
-        <w:t>מידע</w:t>
-      </w:r>
-      <w:r>
-        <w:t>.</w:t>
+        <w:rPr>
+          <w:rtl w:val="1"/>
+        </w:rPr>
+        <w:t>Driver Moodle זו מערכת לניהול לימודי נהיגה. בחרתי בנושא כי ראיתי שכל קביעת שיעור אצל מורה נהיגה נעשית בהודעות וואטסאפ הלוך ושוב, אין יומן אחד, אין מעקב על תשלומים, והתלמיד והמורה לא רואים את אותו מידע.</w:t>
       </w:r>
     </w:p>
     <w:p>
@@ -2282,190 +1937,7 @@
         <w:rPr>
           <w:rtl w:val="1"/>
         </w:rPr>
-        <w:t>המערכת</w:t>
-      </w:r>
-      <w:r>
-        <w:t xml:space="preserve"> </w:t>
-      </w:r>
-      <w:r>
-        <w:rPr>
-          <w:rtl w:val="1"/>
-        </w:rPr>
-        <w:t>נותנת</w:t>
-      </w:r>
-      <w:r>
-        <w:t xml:space="preserve"> </w:t>
-      </w:r>
-      <w:r>
-        <w:rPr>
-          <w:rtl w:val="1"/>
-        </w:rPr>
-        <w:t>פתרון</w:t>
-      </w:r>
-      <w:r>
-        <w:t xml:space="preserve"> </w:t>
-      </w:r>
-      <w:r>
-        <w:rPr>
-          <w:rtl w:val="1"/>
-        </w:rPr>
-        <w:t>מלא</w:t>
-      </w:r>
-      <w:r>
-        <w:t xml:space="preserve"> </w:t>
-      </w:r>
-      <w:r>
-        <w:rPr>
-          <w:rtl w:val="1"/>
-        </w:rPr>
-        <w:t>לשלושה</w:t>
-      </w:r>
-      <w:r>
-        <w:t xml:space="preserve"> </w:t>
-      </w:r>
-      <w:r>
-        <w:rPr>
-          <w:rtl w:val="1"/>
-        </w:rPr>
-        <w:t>סוגי</w:t>
-      </w:r>
-      <w:r>
-        <w:t xml:space="preserve"> </w:t>
-      </w:r>
-      <w:r>
-        <w:rPr>
-          <w:rtl w:val="1"/>
-        </w:rPr>
-        <w:t>משתמשים</w:t>
-      </w:r>
-      <w:r>
-        <w:t xml:space="preserve">: </w:t>
-      </w:r>
-      <w:r>
-        <w:rPr>
-          <w:rtl w:val="1"/>
-        </w:rPr>
-        <w:t>תלמיד</w:t>
-      </w:r>
-      <w:r>
-        <w:t xml:space="preserve">, </w:t>
-      </w:r>
-      <w:r>
-        <w:rPr>
-          <w:rtl w:val="1"/>
-        </w:rPr>
-        <w:t>מורה</w:t>
-      </w:r>
-      <w:r>
-        <w:t xml:space="preserve">, </w:t>
-      </w:r>
-      <w:r>
-        <w:rPr>
-          <w:rtl w:val="1"/>
-        </w:rPr>
-        <w:t>ומנהל</w:t>
-      </w:r>
-      <w:r>
-        <w:t xml:space="preserve">. </w:t>
-      </w:r>
-      <w:r>
-        <w:rPr>
-          <w:rtl w:val="1"/>
-        </w:rPr>
-        <w:t>בנוסף</w:t>
-      </w:r>
-      <w:r>
-        <w:t xml:space="preserve"> </w:t>
-      </w:r>
-      <w:r>
-        <w:rPr>
-          <w:rtl w:val="1"/>
-        </w:rPr>
-        <w:t>קיים</w:t>
-      </w:r>
-      <w:r>
-        <w:t xml:space="preserve"> </w:t>
-      </w:r>
-      <w:r>
-        <w:rPr>
-          <w:rtl w:val="1"/>
-        </w:rPr>
-        <w:t>פיצול</w:t>
-      </w:r>
-      <w:r>
-        <w:t xml:space="preserve"> </w:t>
-      </w:r>
-      <w:r>
-        <w:rPr>
-          <w:rtl w:val="1"/>
-        </w:rPr>
-        <w:t>לשלוש</w:t>
-      </w:r>
-      <w:r>
-        <w:t xml:space="preserve"> </w:t>
-      </w:r>
-      <w:r>
-        <w:rPr>
-          <w:rtl w:val="1"/>
-        </w:rPr>
-        <w:t>פלטפורמות</w:t>
-      </w:r>
-      <w:r>
-        <w:t xml:space="preserve"> </w:t>
-      </w:r>
-      <w:r>
-        <w:rPr>
-          <w:rtl w:val="1"/>
-        </w:rPr>
-        <w:t>לקוח</w:t>
-      </w:r>
-      <w:r>
-        <w:t>: WPF (</w:t>
-      </w:r>
-      <w:r>
-        <w:rPr>
-          <w:rtl w:val="1"/>
-        </w:rPr>
-        <w:t>שולחני</w:t>
-      </w:r>
-      <w:r>
-        <w:t>), Web (</w:t>
-      </w:r>
-      <w:r>
-        <w:rPr>
-          <w:rtl w:val="1"/>
-        </w:rPr>
-        <w:t>דפדפן</w:t>
-      </w:r>
-      <w:r>
-        <w:t xml:space="preserve">), </w:t>
-      </w:r>
-      <w:r>
-        <w:rPr>
-          <w:rtl w:val="1"/>
-        </w:rPr>
-        <w:t>ו</w:t>
-      </w:r>
-      <w:r>
-        <w:t>-MAUI (</w:t>
-      </w:r>
-      <w:r>
-        <w:rPr>
-          <w:rtl w:val="1"/>
-        </w:rPr>
-        <w:t>אנדרואיד</w:t>
-      </w:r>
-      <w:r>
-        <w:t>/iOS/</w:t>
-      </w:r>
-      <w:r>
-        <w:rPr>
-          <w:rtl w:val="1"/>
-        </w:rPr>
-        <w:t>חלונות</w:t>
-      </w:r>
-      <w:r>
-        <w:t>).</w:t>
+        <w:t>יש שלושה סוגי משתמשים: תלמיד, מורה ומנהל. בניתי שלושה לקוחות שונים מול אותו שרת: WPF לדסקטופ, Web ב-Razor Pages, ו-MAUI לאנדרואיד/iOS/Windows.</w:t>
       </w:r>
     </w:p>
     <w:p>
@@ -2585,110 +2057,7 @@
           <w:b/>
           <w:rtl w:val="1"/>
         </w:rPr>
-        <w:t>מטרת</w:t>
-      </w:r>
-      <w:r>
-        <w:rPr>
-          <w:b/>
-        </w:rPr>
-        <w:t xml:space="preserve"> </w:t>
-      </w:r>
-      <w:r>
-        <w:rPr>
-          <w:b/>
-          <w:rtl w:val="1"/>
-        </w:rPr>
-        <w:t>על</w:t>
-      </w:r>
-      <w:r>
-        <w:rPr>
-          <w:b/>
-        </w:rPr>
-        <w:t>:</w:t>
-      </w:r>
-      <w:r>
-        <w:t xml:space="preserve"> </w:t>
-      </w:r>
-      <w:r>
-        <w:rPr>
-          <w:rtl w:val="1"/>
-        </w:rPr>
-        <w:t>לרכז</w:t>
-      </w:r>
-      <w:r>
-        <w:t xml:space="preserve"> </w:t>
-      </w:r>
-      <w:r>
-        <w:rPr>
-          <w:rtl w:val="1"/>
-        </w:rPr>
-        <w:t>במקום</w:t>
-      </w:r>
-      <w:r>
-        <w:t xml:space="preserve"> </w:t>
-      </w:r>
-      <w:r>
-        <w:rPr>
-          <w:rtl w:val="1"/>
-        </w:rPr>
-        <w:t>אחד</w:t>
-      </w:r>
-      <w:r>
-        <w:t xml:space="preserve"> </w:t>
-      </w:r>
-      <w:r>
-        <w:rPr>
-          <w:rtl w:val="1"/>
-        </w:rPr>
-        <w:t>את</w:t>
-      </w:r>
-      <w:r>
-        <w:t xml:space="preserve"> </w:t>
-      </w:r>
-      <w:r>
-        <w:rPr>
-          <w:rtl w:val="1"/>
-        </w:rPr>
-        <w:t>ניהול</w:t>
-      </w:r>
-      <w:r>
-        <w:t xml:space="preserve"> </w:t>
-      </w:r>
-      <w:r>
-        <w:rPr>
-          <w:rtl w:val="1"/>
-        </w:rPr>
-        <w:t>השיעורים</w:t>
-      </w:r>
-      <w:r>
-        <w:t xml:space="preserve">, </w:t>
-      </w:r>
-      <w:r>
-        <w:rPr>
-          <w:rtl w:val="1"/>
-        </w:rPr>
-        <w:t>התשלומים</w:t>
-      </w:r>
-      <w:r>
-        <w:t xml:space="preserve">, </w:t>
-      </w:r>
-      <w:r>
-        <w:rPr>
-          <w:rtl w:val="1"/>
-        </w:rPr>
-        <w:t>ההתראות</w:t>
-      </w:r>
-      <w:r>
-        <w:t xml:space="preserve"> </w:t>
-      </w:r>
-      <w:r>
-        <w:rPr>
-          <w:rtl w:val="1"/>
-        </w:rPr>
-        <w:t>והדיווחים</w:t>
-      </w:r>
-      <w:r>
-        <w:t>.</w:t>
+        <w:t>המטרה: לרכז במקום אחד שיעורים, תשלומים, התראות ודוחות במקום הודעות וואטסאפ ודפי אקסל.</w:t>
       </w:r>
     </w:p>
     <w:p>
@@ -3037,55 +2406,7 @@
         <w:rPr>
           <w:rtl w:val="1"/>
         </w:rPr>
-        <w:t>אבטחת</w:t>
-      </w:r>
-      <w:r>
-        <w:t xml:space="preserve"> </w:t>
-      </w:r>
-      <w:r>
-        <w:rPr>
-          <w:rtl w:val="1"/>
-        </w:rPr>
-        <w:t>סיסמאות</w:t>
-      </w:r>
-      <w:r>
-        <w:t xml:space="preserve"> </w:t>
-      </w:r>
-      <w:r>
-        <w:rPr>
-          <w:rtl w:val="1"/>
-        </w:rPr>
-        <w:t>עם</w:t>
-      </w:r>
-      <w:r>
-        <w:t xml:space="preserve"> hashing </w:t>
-      </w:r>
-      <w:r>
-        <w:rPr>
-          <w:rtl w:val="1"/>
-        </w:rPr>
-        <w:t>מודרני</w:t>
-      </w:r>
-      <w:r>
-        <w:t xml:space="preserve"> </w:t>
-      </w:r>
-      <w:r>
-        <w:rPr>
-          <w:rtl w:val="1"/>
-        </w:rPr>
-        <w:t>וסניטציית</w:t>
-      </w:r>
-      <w:r>
-        <w:t xml:space="preserve"> </w:t>
-      </w:r>
-      <w:r>
-        <w:rPr>
-          <w:rtl w:val="1"/>
-        </w:rPr>
-        <w:t>קלט</w:t>
-      </w:r>
-      <w:r>
-        <w:t>.</w:t>
+        <w:t>אבטחת סיסמאות ב-PBKDF2 וסניטציה של קלט מהמשתמש.</w:t>
       </w:r>
     </w:p>
     <w:p>
@@ -3180,464 +2501,7 @@
           <w:color w:val="555555"/>
           <w:rtl w:val="1"/>
         </w:rPr>
-        <w:t>פרק</w:t>
-      </w:r>
-      <w:r>
-        <w:rPr>
-          <w:i/>
-          <w:color w:val="555555"/>
-        </w:rPr>
-        <w:t xml:space="preserve"> </w:t>
-      </w:r>
-      <w:r>
-        <w:rPr>
-          <w:i/>
-          <w:color w:val="555555"/>
-          <w:rtl w:val="1"/>
-        </w:rPr>
-        <w:t>זה</w:t>
-      </w:r>
-      <w:r>
-        <w:rPr>
-          <w:i/>
-          <w:color w:val="555555"/>
-        </w:rPr>
-        <w:t xml:space="preserve"> </w:t>
-      </w:r>
-      <w:r>
-        <w:rPr>
-          <w:i/>
-          <w:color w:val="555555"/>
-          <w:rtl w:val="1"/>
-        </w:rPr>
-        <w:t>ממופה</w:t>
-      </w:r>
-      <w:r>
-        <w:rPr>
-          <w:i/>
-          <w:color w:val="555555"/>
-        </w:rPr>
-        <w:t xml:space="preserve"> </w:t>
-      </w:r>
-      <w:r>
-        <w:rPr>
-          <w:i/>
-          <w:color w:val="555555"/>
-          <w:rtl w:val="1"/>
-        </w:rPr>
-        <w:t>ישירות</w:t>
-      </w:r>
-      <w:r>
-        <w:rPr>
-          <w:i/>
-          <w:color w:val="555555"/>
-        </w:rPr>
-        <w:t xml:space="preserve"> </w:t>
-      </w:r>
-      <w:r>
-        <w:rPr>
-          <w:i/>
-          <w:color w:val="555555"/>
-          <w:rtl w:val="1"/>
-        </w:rPr>
-        <w:t>מול</w:t>
-      </w:r>
-      <w:r>
-        <w:rPr>
-          <w:i/>
-          <w:color w:val="555555"/>
-        </w:rPr>
-        <w:t xml:space="preserve"> </w:t>
-      </w:r>
-      <w:r>
-        <w:rPr>
-          <w:i/>
-          <w:color w:val="555555"/>
-          <w:rtl w:val="1"/>
-        </w:rPr>
-        <w:t>המסמכים</w:t>
-      </w:r>
-      <w:r>
-        <w:rPr>
-          <w:i/>
-          <w:color w:val="555555"/>
-        </w:rPr>
-        <w:t xml:space="preserve"> *</w:t>
-      </w:r>
-      <w:r>
-        <w:rPr>
-          <w:i/>
-          <w:color w:val="555555"/>
-          <w:rtl w:val="1"/>
-        </w:rPr>
-        <w:t>פירוט</w:t>
-      </w:r>
-      <w:r>
-        <w:rPr>
-          <w:i/>
-          <w:color w:val="555555"/>
-        </w:rPr>
-        <w:t xml:space="preserve"> </w:t>
-      </w:r>
-      <w:r>
-        <w:rPr>
-          <w:i/>
-          <w:color w:val="555555"/>
-          <w:rtl w:val="1"/>
-        </w:rPr>
-        <w:t>דרישות</w:t>
-      </w:r>
-      <w:r>
-        <w:rPr>
-          <w:i/>
-          <w:color w:val="555555"/>
-        </w:rPr>
-        <w:t xml:space="preserve"> </w:t>
-      </w:r>
-      <w:r>
-        <w:rPr>
-          <w:i/>
-          <w:color w:val="555555"/>
-          <w:rtl w:val="1"/>
-        </w:rPr>
-        <w:t>חלק</w:t>
-      </w:r>
-      <w:r>
-        <w:rPr>
-          <w:i/>
-          <w:color w:val="555555"/>
-        </w:rPr>
-        <w:t xml:space="preserve"> 1* </w:t>
-      </w:r>
-      <w:r>
-        <w:rPr>
-          <w:i/>
-          <w:color w:val="555555"/>
-          <w:rtl w:val="1"/>
-        </w:rPr>
-        <w:t>ו</w:t>
-      </w:r>
-      <w:r>
-        <w:rPr>
-          <w:i/>
-          <w:color w:val="555555"/>
-        </w:rPr>
-        <w:t>-*</w:t>
-      </w:r>
-      <w:r>
-        <w:rPr>
-          <w:i/>
-          <w:color w:val="555555"/>
-          <w:rtl w:val="1"/>
-        </w:rPr>
-        <w:t>בדיקת</w:t>
-      </w:r>
-      <w:r>
-        <w:rPr>
-          <w:i/>
-          <w:color w:val="555555"/>
-        </w:rPr>
-        <w:t xml:space="preserve"> </w:t>
-      </w:r>
-      <w:r>
-        <w:rPr>
-          <w:i/>
-          <w:color w:val="555555"/>
-          <w:rtl w:val="1"/>
-        </w:rPr>
-        <w:t>פרויקט</w:t>
-      </w:r>
-      <w:r>
-        <w:rPr>
-          <w:i/>
-          <w:color w:val="555555"/>
-        </w:rPr>
-        <w:t xml:space="preserve"> </w:t>
-      </w:r>
-      <w:r>
-        <w:rPr>
-          <w:i/>
-          <w:color w:val="555555"/>
-          <w:rtl w:val="1"/>
-        </w:rPr>
-        <w:t>וספר</w:t>
-      </w:r>
-      <w:r>
-        <w:rPr>
-          <w:i/>
-          <w:color w:val="555555"/>
-        </w:rPr>
-        <w:t xml:space="preserve"> </w:t>
-      </w:r>
-      <w:r>
-        <w:rPr>
-          <w:i/>
-          <w:color w:val="555555"/>
-          <w:rtl w:val="1"/>
-        </w:rPr>
-        <w:t>פרויקט</w:t>
-      </w:r>
-      <w:r>
-        <w:rPr>
-          <w:i/>
-          <w:color w:val="555555"/>
-        </w:rPr>
-        <w:t xml:space="preserve"> </w:t>
-      </w:r>
-      <w:r>
-        <w:rPr>
-          <w:i/>
-          <w:color w:val="555555"/>
-          <w:rtl w:val="1"/>
-        </w:rPr>
-        <w:t>עפ</w:t>
-      </w:r>
-      <w:r>
-        <w:rPr>
-          <w:i/>
-          <w:color w:val="555555"/>
-        </w:rPr>
-        <w:t>"</w:t>
-      </w:r>
-      <w:r>
-        <w:rPr>
-          <w:i/>
-          <w:color w:val="555555"/>
-          <w:rtl w:val="1"/>
-        </w:rPr>
-        <w:t>י</w:t>
-      </w:r>
-      <w:r>
-        <w:rPr>
-          <w:i/>
-          <w:color w:val="555555"/>
-        </w:rPr>
-        <w:t xml:space="preserve"> </w:t>
-      </w:r>
-      <w:r>
-        <w:rPr>
-          <w:i/>
-          <w:color w:val="555555"/>
-          <w:rtl w:val="1"/>
-        </w:rPr>
-        <w:t>דרישות</w:t>
-      </w:r>
-      <w:r>
-        <w:rPr>
-          <w:i/>
-          <w:color w:val="555555"/>
-        </w:rPr>
-        <w:t xml:space="preserve">*. </w:t>
-      </w:r>
-      <w:r>
-        <w:rPr>
-          <w:i/>
-          <w:color w:val="555555"/>
-          <w:rtl w:val="1"/>
-        </w:rPr>
-        <w:t>כל</w:t>
-      </w:r>
-      <w:r>
-        <w:rPr>
-          <w:i/>
-          <w:color w:val="555555"/>
-        </w:rPr>
-        <w:t xml:space="preserve"> </w:t>
-      </w:r>
-      <w:r>
-        <w:rPr>
-          <w:i/>
-          <w:color w:val="555555"/>
-          <w:rtl w:val="1"/>
-        </w:rPr>
-        <w:t>סעיף</w:t>
-      </w:r>
-      <w:r>
-        <w:rPr>
-          <w:i/>
-          <w:color w:val="555555"/>
-        </w:rPr>
-        <w:t xml:space="preserve"> </w:t>
-      </w:r>
-      <w:r>
-        <w:rPr>
-          <w:i/>
-          <w:color w:val="555555"/>
-          <w:rtl w:val="1"/>
-        </w:rPr>
-        <w:t>מציין</w:t>
-      </w:r>
-      <w:r>
-        <w:rPr>
-          <w:i/>
-          <w:color w:val="555555"/>
-        </w:rPr>
-        <w:t xml:space="preserve"> </w:t>
-      </w:r>
-      <w:r>
-        <w:rPr>
-          <w:i/>
-          <w:color w:val="555555"/>
-          <w:rtl w:val="1"/>
-        </w:rPr>
-        <w:t>היכן</w:t>
-      </w:r>
-      <w:r>
-        <w:rPr>
-          <w:i/>
-          <w:color w:val="555555"/>
-        </w:rPr>
-        <w:t xml:space="preserve"> </w:t>
-      </w:r>
-      <w:r>
-        <w:rPr>
-          <w:i/>
-          <w:color w:val="555555"/>
-          <w:rtl w:val="1"/>
-        </w:rPr>
-        <w:t>בפרויקט</w:t>
-      </w:r>
-      <w:r>
-        <w:rPr>
-          <w:i/>
-          <w:color w:val="555555"/>
-        </w:rPr>
-        <w:t xml:space="preserve"> </w:t>
-      </w:r>
-      <w:r>
-        <w:rPr>
-          <w:i/>
-          <w:color w:val="555555"/>
-          <w:rtl w:val="1"/>
-        </w:rPr>
-        <w:t>נמצא</w:t>
-      </w:r>
-      <w:r>
-        <w:rPr>
-          <w:i/>
-          <w:color w:val="555555"/>
-        </w:rPr>
-        <w:t xml:space="preserve"> </w:t>
-      </w:r>
-      <w:r>
-        <w:rPr>
-          <w:i/>
-          <w:color w:val="555555"/>
-          <w:rtl w:val="1"/>
-        </w:rPr>
-        <w:t>המענה</w:t>
-      </w:r>
-      <w:r>
-        <w:rPr>
-          <w:i/>
-          <w:color w:val="555555"/>
-        </w:rPr>
-        <w:t xml:space="preserve"> (</w:t>
-      </w:r>
-      <w:r>
-        <w:rPr>
-          <w:i/>
-          <w:color w:val="555555"/>
-          <w:rtl w:val="1"/>
-        </w:rPr>
-        <w:t>קובץ</w:t>
-      </w:r>
-      <w:r>
-        <w:rPr>
-          <w:i/>
-          <w:color w:val="555555"/>
-        </w:rPr>
-        <w:t xml:space="preserve"> + </w:t>
-      </w:r>
-      <w:r>
-        <w:rPr>
-          <w:i/>
-          <w:color w:val="555555"/>
-          <w:rtl w:val="1"/>
-        </w:rPr>
-        <w:t>שורה</w:t>
-      </w:r>
-      <w:r>
-        <w:rPr>
-          <w:i/>
-          <w:color w:val="555555"/>
-        </w:rPr>
-        <w:t xml:space="preserve">) </w:t>
-      </w:r>
-      <w:r>
-        <w:rPr>
-          <w:i/>
-          <w:color w:val="555555"/>
-          <w:rtl w:val="1"/>
-        </w:rPr>
-        <w:t>ומפנה</w:t>
-      </w:r>
-      <w:r>
-        <w:rPr>
-          <w:i/>
-          <w:color w:val="555555"/>
-        </w:rPr>
-        <w:t xml:space="preserve"> </w:t>
-      </w:r>
-      <w:r>
-        <w:rPr>
-          <w:i/>
-          <w:color w:val="555555"/>
-          <w:rtl w:val="1"/>
-        </w:rPr>
-        <w:t>לפרק</w:t>
-      </w:r>
-      <w:r>
-        <w:rPr>
-          <w:i/>
-          <w:color w:val="555555"/>
-        </w:rPr>
-        <w:t xml:space="preserve"> </w:t>
-      </w:r>
-      <w:r>
-        <w:rPr>
-          <w:i/>
-          <w:color w:val="555555"/>
-          <w:rtl w:val="1"/>
-        </w:rPr>
-        <w:t>המפורט</w:t>
-      </w:r>
-      <w:r>
-        <w:rPr>
-          <w:i/>
-          <w:color w:val="555555"/>
-        </w:rPr>
-        <w:t xml:space="preserve"> </w:t>
-      </w:r>
-      <w:r>
-        <w:rPr>
-          <w:i/>
-          <w:color w:val="555555"/>
-          <w:rtl w:val="1"/>
-        </w:rPr>
-        <w:t>בהמשך</w:t>
-      </w:r>
-      <w:r>
-        <w:rPr>
-          <w:i/>
-          <w:color w:val="555555"/>
-        </w:rPr>
-        <w:t xml:space="preserve"> </w:t>
-      </w:r>
-      <w:r>
-        <w:rPr>
-          <w:i/>
-          <w:color w:val="555555"/>
-          <w:rtl w:val="1"/>
-        </w:rPr>
-        <w:t>הספר</w:t>
-      </w:r>
-      <w:r>
-        <w:rPr>
-          <w:i/>
-          <w:color w:val="555555"/>
-        </w:rPr>
-        <w:t>.</w:t>
+        <w:t>בפרק הזה אני עוברת על המחוון סעיף-סעיף ומראה איפה כל דרישה ממומשת בקוד (קובץ ושורה), עם הפנייה לפרק שבו זה מוסבר במלואו.</w:t>
       </w:r>
     </w:p>
     <w:p>
@@ -9186,106 +8050,7 @@
           <w:b/>
           <w:rtl w:val="1"/>
         </w:rPr>
-        <w:t>הבעיה</w:t>
-      </w:r>
-      <w:r>
-        <w:rPr>
-          <w:b/>
-        </w:rPr>
-        <w:t>:</w:t>
-      </w:r>
-      <w:r>
-        <w:t xml:space="preserve"> </w:t>
-      </w:r>
-      <w:r>
-        <w:rPr>
-          <w:rtl w:val="1"/>
-        </w:rPr>
-        <w:t>קביעת</w:t>
-      </w:r>
-      <w:r>
-        <w:t xml:space="preserve"> </w:t>
-      </w:r>
-      <w:r>
-        <w:rPr>
-          <w:rtl w:val="1"/>
-        </w:rPr>
-        <w:t>שיעורי</w:t>
-      </w:r>
-      <w:r>
-        <w:t xml:space="preserve"> </w:t>
-      </w:r>
-      <w:r>
-        <w:rPr>
-          <w:rtl w:val="1"/>
-        </w:rPr>
-        <w:t>נהיגה</w:t>
-      </w:r>
-      <w:r>
-        <w:t xml:space="preserve"> </w:t>
-      </w:r>
-      <w:r>
-        <w:rPr>
-          <w:rtl w:val="1"/>
-        </w:rPr>
-        <w:t>וניהול</w:t>
-      </w:r>
-      <w:r>
-        <w:t xml:space="preserve"> </w:t>
-      </w:r>
-      <w:r>
-        <w:rPr>
-          <w:rtl w:val="1"/>
-        </w:rPr>
-        <w:t>תשלומים</w:t>
-      </w:r>
-      <w:r>
-        <w:t xml:space="preserve"> </w:t>
-      </w:r>
-      <w:r>
-        <w:rPr>
-          <w:rtl w:val="1"/>
-        </w:rPr>
-        <w:t>מתבצעים</w:t>
-      </w:r>
-      <w:r>
-        <w:t xml:space="preserve"> </w:t>
-      </w:r>
-      <w:r>
-        <w:rPr>
-          <w:rtl w:val="1"/>
-        </w:rPr>
-        <w:t>ידנית</w:t>
-      </w:r>
-      <w:r>
-        <w:t xml:space="preserve"> </w:t>
-      </w:r>
-      <w:r>
-        <w:rPr>
-          <w:rtl w:val="1"/>
-        </w:rPr>
-        <w:t>ללא</w:t>
-      </w:r>
-      <w:r>
-        <w:t xml:space="preserve"> </w:t>
-      </w:r>
-      <w:r>
-        <w:rPr>
-          <w:rtl w:val="1"/>
-        </w:rPr>
-        <w:t>מערכת</w:t>
-      </w:r>
-      <w:r>
-        <w:t xml:space="preserve"> </w:t>
-      </w:r>
-      <w:r>
-        <w:rPr>
-          <w:rtl w:val="1"/>
-        </w:rPr>
-        <w:t>מרכזית</w:t>
-      </w:r>
-      <w:r>
-        <w:t>.</w:t>
+        <w:t>הבעיה: שיעורי נהיגה ותשלומים מנוהלים היום ידנית בלי שום מקום אחד מסודר.</w:t>
       </w:r>
     </w:p>
     <w:p>
@@ -9298,124 +8063,7 @@
           <w:b/>
           <w:rtl w:val="1"/>
         </w:rPr>
-        <w:t>הפתרון</w:t>
-      </w:r>
-      <w:r>
-        <w:rPr>
-          <w:b/>
-        </w:rPr>
-        <w:t>:</w:t>
-      </w:r>
-      <w:r>
-        <w:t xml:space="preserve"> </w:t>
-      </w:r>
-      <w:r>
-        <w:rPr>
-          <w:rtl w:val="1"/>
-        </w:rPr>
-        <w:t>מערכת</w:t>
-      </w:r>
-      <w:r>
-        <w:t xml:space="preserve"> </w:t>
-      </w:r>
-      <w:r>
-        <w:rPr>
-          <w:rtl w:val="1"/>
-        </w:rPr>
-        <w:t>שרת</w:t>
-      </w:r>
-      <w:r>
-        <w:t>-</w:t>
-      </w:r>
-      <w:r>
-        <w:rPr>
-          <w:rtl w:val="1"/>
-        </w:rPr>
-        <w:t>לקוח</w:t>
-      </w:r>
-      <w:r>
-        <w:t xml:space="preserve"> </w:t>
-      </w:r>
-      <w:r>
-        <w:rPr>
-          <w:rtl w:val="1"/>
-        </w:rPr>
-        <w:t>שמרכזת</w:t>
-      </w:r>
-      <w:r>
-        <w:t xml:space="preserve"> </w:t>
-      </w:r>
-      <w:r>
-        <w:rPr>
-          <w:rtl w:val="1"/>
-        </w:rPr>
-        <w:t>שיעורים</w:t>
-      </w:r>
-      <w:r>
-        <w:t xml:space="preserve">, </w:t>
-      </w:r>
-      <w:r>
-        <w:rPr>
-          <w:rtl w:val="1"/>
-        </w:rPr>
-        <w:t>תלמידים</w:t>
-      </w:r>
-      <w:r>
-        <w:t xml:space="preserve">, </w:t>
-      </w:r>
-      <w:r>
-        <w:rPr>
-          <w:rtl w:val="1"/>
-        </w:rPr>
-        <w:t>מורים</w:t>
-      </w:r>
-      <w:r>
-        <w:t xml:space="preserve">, </w:t>
-      </w:r>
-      <w:r>
-        <w:rPr>
-          <w:rtl w:val="1"/>
-        </w:rPr>
-        <w:t>תשלומים</w:t>
-      </w:r>
-      <w:r>
-        <w:t xml:space="preserve">, </w:t>
-      </w:r>
-      <w:r>
-        <w:rPr>
-          <w:rtl w:val="1"/>
-        </w:rPr>
-        <w:t>הודעות</w:t>
-      </w:r>
-      <w:r>
-        <w:t xml:space="preserve">, </w:t>
-      </w:r>
-      <w:r>
-        <w:rPr>
-          <w:rtl w:val="1"/>
-        </w:rPr>
-        <w:t>קורסים</w:t>
-      </w:r>
-      <w:r>
-        <w:t xml:space="preserve"> </w:t>
-      </w:r>
-      <w:r>
-        <w:rPr>
-          <w:rtl w:val="1"/>
-        </w:rPr>
-        <w:t>ופניות</w:t>
-      </w:r>
-      <w:r>
-        <w:t xml:space="preserve"> </w:t>
-      </w:r>
-      <w:r>
-        <w:rPr>
-          <w:rtl w:val="1"/>
-        </w:rPr>
-        <w:t>תמיכה</w:t>
-      </w:r>
-      <w:r>
-        <w:t>.</w:t>
+        <w:t>הפתרון: שרת WCF אחד עם שלושה לקוחות שמדברים איתו ומנהלים את כל הנתונים — שיעורים, תלמידים, מורים, תשלומים, הודעות, קורסים ופניות תמיכה.</w:t>
       </w:r>
     </w:p>
     <w:p>
@@ -9428,88 +8076,7 @@
           <w:b/>
           <w:rtl w:val="1"/>
         </w:rPr>
-        <w:t>ערך</w:t>
-      </w:r>
-      <w:r>
-        <w:rPr>
-          <w:b/>
-        </w:rPr>
-        <w:t>:</w:t>
-      </w:r>
-      <w:r>
-        <w:t xml:space="preserve"> </w:t>
-      </w:r>
-      <w:r>
-        <w:rPr>
-          <w:rtl w:val="1"/>
-        </w:rPr>
-        <w:t>חיסכון</w:t>
-      </w:r>
-      <w:r>
-        <w:t xml:space="preserve"> </w:t>
-      </w:r>
-      <w:r>
-        <w:rPr>
-          <w:rtl w:val="1"/>
-        </w:rPr>
-        <w:t>בזמן</w:t>
-      </w:r>
-      <w:r>
-        <w:t xml:space="preserve">, </w:t>
-      </w:r>
-      <w:r>
-        <w:rPr>
-          <w:rtl w:val="1"/>
-        </w:rPr>
-        <w:t>פחות</w:t>
-      </w:r>
-      <w:r>
-        <w:t xml:space="preserve"> </w:t>
-      </w:r>
-      <w:r>
-        <w:rPr>
-          <w:rtl w:val="1"/>
-        </w:rPr>
-        <w:t>טעויות</w:t>
-      </w:r>
-      <w:r>
-        <w:t xml:space="preserve">, </w:t>
-      </w:r>
-      <w:r>
-        <w:rPr>
-          <w:rtl w:val="1"/>
-        </w:rPr>
-        <w:t>שקיפות</w:t>
-      </w:r>
-      <w:r>
-        <w:t xml:space="preserve"> </w:t>
-      </w:r>
-      <w:r>
-        <w:rPr>
-          <w:rtl w:val="1"/>
-        </w:rPr>
-        <w:t>בין</w:t>
-      </w:r>
-      <w:r>
-        <w:t xml:space="preserve"> </w:t>
-      </w:r>
-      <w:r>
-        <w:rPr>
-          <w:rtl w:val="1"/>
-        </w:rPr>
-        <w:t>תלמיד</w:t>
-      </w:r>
-      <w:r>
-        <w:t xml:space="preserve"> </w:t>
-      </w:r>
-      <w:r>
-        <w:rPr>
-          <w:rtl w:val="1"/>
-        </w:rPr>
-        <w:t>למורה</w:t>
-      </w:r>
-      <w:r>
-        <w:t>.</w:t>
+        <w:t>תלמיד ומורה רואים את אותם נתונים, פחות פספוסים על תשלומים ושעות.</w:t>
       </w:r>
     </w:p>
     <w:p>
@@ -12044,207 +10611,15 @@
     </w:p>
     <w:p>
       <w:pPr>
-        <w:jc w:val="left"/>
+        <w:jc w:val="right"/>
+        <w:bidi w:val="1"/>
       </w:pPr>
       <w:r>
         <w:rPr>
           <w:b/>
-        </w:rPr>
-        <w:t>הסבר</w:t>
-      </w:r>
-      <w:r>
-        <w:rPr>
-          <w:b/>
-        </w:rPr>
-        <w:t>:</w:t>
-      </w:r>
-      <w:r>
-        <w:rPr/>
-        <w:t xml:space="preserve"> Binding </w:t>
-      </w:r>
-      <w:r>
-        <w:rPr/>
-        <w:t>מסוג</w:t>
-      </w:r>
-      <w:r>
-        <w:rPr/>
-        <w:t xml:space="preserve"> </w:t>
-      </w:r>
-      <w:r>
-        <w:rPr>
-          <w:rFonts w:ascii="Consolas" w:hAnsi="Consolas"/>
-          <w:color w:val="C7254E"/>
-          <w:sz w:val="18"/>
-        </w:rPr>
-        <w:t>basicHttpBinding</w:t>
-      </w:r>
-      <w:r>
-        <w:rPr/>
-        <w:t xml:space="preserve"> </w:t>
-      </w:r>
-      <w:r>
-        <w:rPr/>
-        <w:t>נבחר</w:t>
-      </w:r>
-      <w:r>
-        <w:rPr/>
-        <w:t xml:space="preserve"> </w:t>
-      </w:r>
-      <w:r>
-        <w:rPr/>
-        <w:t>כדי</w:t>
-      </w:r>
-      <w:r>
-        <w:rPr/>
-        <w:t xml:space="preserve"> </w:t>
-      </w:r>
-      <w:r>
-        <w:rPr/>
-        <w:t>לאפשר</w:t>
-      </w:r>
-      <w:r>
-        <w:rPr/>
-        <w:t xml:space="preserve"> </w:t>
-      </w:r>
-      <w:r>
-        <w:rPr/>
-        <w:t>תקשורת</w:t>
-      </w:r>
-      <w:r>
-        <w:rPr/>
-        <w:t xml:space="preserve"> SOAP </w:t>
-      </w:r>
-      <w:r>
-        <w:rPr/>
-        <w:t>פשוטה</w:t>
-      </w:r>
-      <w:r>
-        <w:rPr/>
-        <w:t xml:space="preserve"> </w:t>
-      </w:r>
-      <w:r>
-        <w:rPr/>
-        <w:t>גם</w:t>
-      </w:r>
-      <w:r>
-        <w:rPr/>
-        <w:t xml:space="preserve"> </w:t>
-      </w:r>
-      <w:r>
-        <w:rPr/>
-        <w:t>עם</w:t>
-      </w:r>
-      <w:r>
-        <w:rPr/>
-        <w:t xml:space="preserve"> MAUI </w:t>
-      </w:r>
-      <w:r>
-        <w:rPr/>
-        <w:t>ועם</w:t>
-      </w:r>
-      <w:r>
-        <w:rPr/>
-        <w:t xml:space="preserve"> Web ASP.NET Core (</w:t>
-      </w:r>
-      <w:r>
-        <w:rPr/>
-        <w:t>שאינם</w:t>
-      </w:r>
-      <w:r>
-        <w:rPr/>
-        <w:t xml:space="preserve"> </w:t>
-      </w:r>
-      <w:r>
-        <w:rPr/>
-        <w:t>תומכים</w:t>
-      </w:r>
-      <w:r>
-        <w:rPr/>
-        <w:t xml:space="preserve"> </w:t>
-      </w:r>
-      <w:r>
-        <w:rPr/>
-        <w:t>ב</w:t>
-      </w:r>
-      <w:r>
-        <w:rPr/>
-        <w:t xml:space="preserve">-WSHttpBinding </w:t>
-      </w:r>
-      <w:r>
-        <w:rPr/>
-        <w:t>מלא</w:t>
-      </w:r>
-      <w:r>
-        <w:rPr/>
-        <w:t xml:space="preserve">). </w:t>
-      </w:r>
-      <w:r>
-        <w:rPr>
-          <w:rFonts w:ascii="Consolas" w:hAnsi="Consolas"/>
-          <w:color w:val="C7254E"/>
-          <w:sz w:val="18"/>
-        </w:rPr>
-        <w:t>includeExceptionDetailInFaults="True"</w:t>
-      </w:r>
-      <w:r>
-        <w:rPr/>
-        <w:t xml:space="preserve"> </w:t>
-      </w:r>
-      <w:r>
-        <w:rPr/>
-        <w:t>מאפשר</w:t>
-      </w:r>
-      <w:r>
-        <w:rPr/>
-        <w:t xml:space="preserve"> </w:t>
-      </w:r>
-      <w:r>
-        <w:rPr/>
-        <w:t>שחרור</w:t>
-      </w:r>
-      <w:r>
-        <w:rPr/>
-        <w:t xml:space="preserve"> </w:t>
-      </w:r>
-      <w:r>
-        <w:rPr/>
-        <w:t>פרטי</w:t>
-      </w:r>
-      <w:r>
-        <w:rPr/>
-        <w:t xml:space="preserve"> </w:t>
-      </w:r>
-      <w:r>
-        <w:rPr/>
-        <w:t>שגיאה</w:t>
-      </w:r>
-      <w:r>
-        <w:rPr/>
-        <w:t xml:space="preserve"> </w:t>
-      </w:r>
-      <w:r>
-        <w:rPr/>
-        <w:t>לקליינט</w:t>
-      </w:r>
-      <w:r>
-        <w:rPr/>
-        <w:t xml:space="preserve"> </w:t>
-      </w:r>
-      <w:r>
-        <w:rPr/>
-        <w:t>בזמן</w:t>
-      </w:r>
-      <w:r>
-        <w:rPr/>
-        <w:t xml:space="preserve"> </w:t>
-      </w:r>
-      <w:r>
-        <w:rPr/>
-        <w:t>פיתוח</w:t>
-      </w:r>
-      <w:r>
-        <w:rPr/>
-        <w:t>.</w:t>
+          <w:rtl w:val="1"/>
+        </w:rPr>
+        <w:t>בחרתי ב-basicHttpBinding כי MAUI ו-ASP.NET Core לא תומכים ב-WSHttpBinding מלא, וזה ה-binding הכי פשוט שעובד עם SOAP אצל כולם. שמתי includeExceptionDetailInFaults="True" כדי שאני אראה בלקוח את ההודעה האמיתית של השגיאה בזמן הפיתוח, אחרת קיבלתי רק "internal error" בלי מידע.</w:t>
       </w:r>
     </w:p>
     <w:p>
@@ -14653,319 +13028,15 @@
     </w:p>
     <w:p>
       <w:pPr>
-        <w:jc w:val="left"/>
+        <w:jc w:val="right"/>
+        <w:bidi w:val="1"/>
       </w:pPr>
       <w:r>
         <w:rPr>
           <w:b/>
-        </w:rPr>
-        <w:t>הסבר</w:t>
-      </w:r>
-      <w:r>
-        <w:rPr>
-          <w:b/>
-        </w:rPr>
-        <w:t>:</w:t>
-      </w:r>
-      <w:r>
-        <w:rPr/>
-        <w:t xml:space="preserve"> </w:t>
-      </w:r>
-      <w:r>
-        <w:rPr/>
-        <w:t>השיטה</w:t>
-      </w:r>
-      <w:r>
-        <w:rPr/>
-        <w:t xml:space="preserve"> </w:t>
-      </w:r>
-      <w:r>
-        <w:rPr/>
-        <w:t>משתמשת</w:t>
-      </w:r>
-      <w:r>
-        <w:rPr/>
-        <w:t xml:space="preserve"> </w:t>
-      </w:r>
-      <w:r>
-        <w:rPr/>
-        <w:t>ב</w:t>
-      </w:r>
-      <w:r>
-        <w:rPr/>
-        <w:t>-</w:t>
-      </w:r>
-      <w:r>
-        <w:rPr>
-          <w:rFonts w:ascii="Consolas" w:hAnsi="Consolas"/>
-          <w:color w:val="C7254E"/>
-          <w:sz w:val="18"/>
-        </w:rPr>
-        <w:t>conn.GetSchema()</w:t>
-      </w:r>
-      <w:r>
-        <w:rPr/>
-        <w:t xml:space="preserve"> </w:t>
-      </w:r>
-      <w:r>
-        <w:rPr/>
-        <w:t>כדי</w:t>
-      </w:r>
-      <w:r>
-        <w:rPr/>
-        <w:t xml:space="preserve"> </w:t>
-      </w:r>
-      <w:r>
-        <w:rPr/>
-        <w:t>לקרוא</w:t>
-      </w:r>
-      <w:r>
-        <w:rPr/>
-        <w:t xml:space="preserve"> </w:t>
-      </w:r>
-      <w:r>
-        <w:rPr/>
-        <w:t>את</w:t>
-      </w:r>
-      <w:r>
-        <w:rPr/>
-        <w:t xml:space="preserve"> </w:t>
-      </w:r>
-      <w:r>
-        <w:rPr/>
-        <w:t>ה</w:t>
-      </w:r>
-      <w:r>
-        <w:rPr/>
-        <w:t xml:space="preserve">-metadata </w:t>
-      </w:r>
-      <w:r>
-        <w:rPr/>
-        <w:t>של</w:t>
-      </w:r>
-      <w:r>
-        <w:rPr/>
-        <w:t xml:space="preserve"> </w:t>
-      </w:r>
-      <w:r>
-        <w:rPr/>
-        <w:t>ה</w:t>
-      </w:r>
-      <w:r>
-        <w:rPr/>
-        <w:t xml:space="preserve">-DB </w:t>
-      </w:r>
-      <w:r>
-        <w:rPr/>
-        <w:t>ולוודא</w:t>
-      </w:r>
-      <w:r>
-        <w:rPr/>
-        <w:t xml:space="preserve"> </w:t>
-      </w:r>
-      <w:r>
-        <w:rPr/>
-        <w:t>שהעמודות</w:t>
-      </w:r>
-      <w:r>
-        <w:rPr/>
-        <w:t xml:space="preserve"> </w:t>
-      </w:r>
-      <w:r>
-        <w:rPr/>
-        <w:t>הנכונות</w:t>
-      </w:r>
-      <w:r>
-        <w:rPr/>
-        <w:t xml:space="preserve"> </w:t>
-      </w:r>
-      <w:r>
-        <w:rPr/>
-        <w:t>קיימות</w:t>
-      </w:r>
-      <w:r>
-        <w:rPr/>
-        <w:t xml:space="preserve">. </w:t>
-      </w:r>
-      <w:r>
-        <w:rPr/>
-        <w:t>אם</w:t>
-      </w:r>
-      <w:r>
-        <w:rPr/>
-        <w:t xml:space="preserve"> </w:t>
-      </w:r>
-      <w:r>
-        <w:rPr/>
-        <w:t>לא</w:t>
-      </w:r>
-      <w:r>
-        <w:rPr/>
-        <w:t xml:space="preserve"> — </w:t>
-      </w:r>
-      <w:r>
-        <w:rPr/>
-        <w:t>היא</w:t>
-      </w:r>
-      <w:r>
-        <w:rPr/>
-        <w:t xml:space="preserve"> </w:t>
-      </w:r>
-      <w:r>
-        <w:rPr/>
-        <w:t>מוחקת</w:t>
-      </w:r>
-      <w:r>
-        <w:rPr/>
-        <w:t xml:space="preserve"> </w:t>
-      </w:r>
-      <w:r>
-        <w:rPr/>
-        <w:t>את</w:t>
-      </w:r>
-      <w:r>
-        <w:rPr/>
-        <w:t xml:space="preserve"> </w:t>
-      </w:r>
-      <w:r>
-        <w:rPr/>
-        <w:t>הטבלה</w:t>
-      </w:r>
-      <w:r>
-        <w:rPr/>
-        <w:t xml:space="preserve"> </w:t>
-      </w:r>
-      <w:r>
-        <w:rPr/>
-        <w:t>ויוצרת</w:t>
-      </w:r>
-      <w:r>
-        <w:rPr/>
-        <w:t xml:space="preserve"> </w:t>
-      </w:r>
-      <w:r>
-        <w:rPr/>
-        <w:t>אותה</w:t>
-      </w:r>
-      <w:r>
-        <w:rPr/>
-        <w:t xml:space="preserve"> </w:t>
-      </w:r>
-      <w:r>
-        <w:rPr/>
-        <w:t>מחדש</w:t>
-      </w:r>
-      <w:r>
-        <w:rPr/>
-        <w:t xml:space="preserve"> </w:t>
-      </w:r>
-      <w:r>
-        <w:rPr/>
-        <w:t>לפי</w:t>
-      </w:r>
-      <w:r>
-        <w:rPr/>
-        <w:t xml:space="preserve"> DDL </w:t>
-      </w:r>
-      <w:r>
-        <w:rPr/>
-        <w:t>מסודר</w:t>
-      </w:r>
-      <w:r>
-        <w:rPr/>
-        <w:t xml:space="preserve">. </w:t>
-      </w:r>
-      <w:r>
-        <w:rPr/>
-        <w:t>שימוש</w:t>
-      </w:r>
-      <w:r>
-        <w:rPr/>
-        <w:t xml:space="preserve"> </w:t>
-      </w:r>
-      <w:r>
-        <w:rPr/>
-        <w:t>ב</w:t>
-      </w:r>
-      <w:r>
-        <w:rPr/>
-        <w:t>-</w:t>
-      </w:r>
-      <w:r>
-        <w:rPr>
-          <w:rFonts w:ascii="Consolas" w:hAnsi="Consolas"/>
-          <w:color w:val="C7254E"/>
-          <w:sz w:val="18"/>
-        </w:rPr>
-        <w:t>lock</w:t>
-      </w:r>
-      <w:r>
-        <w:rPr/>
-        <w:t xml:space="preserve"> </w:t>
-      </w:r>
-      <w:r>
-        <w:rPr/>
-        <w:t>מבטיח</w:t>
-      </w:r>
-      <w:r>
-        <w:rPr/>
-        <w:t xml:space="preserve"> </w:t>
-      </w:r>
-      <w:r>
-        <w:rPr/>
-        <w:t>שהבדיקה</w:t>
-      </w:r>
-      <w:r>
-        <w:rPr/>
-        <w:t xml:space="preserve"> </w:t>
-      </w:r>
-      <w:r>
-        <w:rPr/>
-        <w:t>תרוץ</w:t>
-      </w:r>
-      <w:r>
-        <w:rPr/>
-        <w:t xml:space="preserve"> </w:t>
-      </w:r>
-      <w:r>
-        <w:rPr/>
-        <w:t>פעם</w:t>
-      </w:r>
-      <w:r>
-        <w:rPr/>
-        <w:t xml:space="preserve"> </w:t>
-      </w:r>
-      <w:r>
-        <w:rPr/>
-        <w:t>אחת</w:t>
-      </w:r>
-      <w:r>
-        <w:rPr/>
-        <w:t xml:space="preserve"> </w:t>
-      </w:r>
-      <w:r>
-        <w:rPr/>
-        <w:t>בלבד</w:t>
-      </w:r>
-      <w:r>
-        <w:rPr/>
-        <w:t xml:space="preserve"> </w:t>
-      </w:r>
-      <w:r>
-        <w:rPr/>
-        <w:t>גם</w:t>
-      </w:r>
-      <w:r>
-        <w:rPr/>
-        <w:t xml:space="preserve"> </w:t>
-      </w:r>
-      <w:r>
-        <w:rPr/>
-        <w:t>תחת</w:t>
-      </w:r>
-      <w:r>
-        <w:rPr/>
-        <w:t xml:space="preserve"> WCF concurrency.</w:t>
+          <w:rtl w:val="1"/>
+        </w:rPr>
+        <w:t>כתבתי את זה כי כשהוספתי עמודות חדשות לטבלת Notifications פתאום שאילתות נפלו על "שדה לא קיים". במקום למחוק ידנית כל פעם, השיטה קוראת ל-GetSchema, בודקת איזה עמודות קיימות, ואם משהו חסר היא עושה DROP ויוצרת מחדש לפי ה-DDL. עטפתי ב-lock כדי שזה ירוץ פעם אחת גם אם שני thread של WCF נכנסים יחד.</w:t>
       </w:r>
     </w:p>
     <w:p>
@@ -16251,7 +14322,7 @@
         <w:rPr>
           <w:rtl w:val="1"/>
         </w:rPr>
-        <w:t>הממשק כולל היום (לאחר כל התוספות) 79 פעולות שירות המכוסות 11 קטגוריות: lesson, user, admin, pricing, calendar, rating, chat, payment, support ticket, course, notification.</w:t>
+        <w:t>ב-IService1 יש בסה"כ 79 פעולות, מחולקות ל-11 קטגוריות: lesson, user, admin, pricing, calendar, rating, chat, payment, support ticket, course ו-notification.</w:t>
       </w:r>
     </w:p>
     <w:p>
@@ -17815,123 +15886,14 @@
     </w:p>
     <w:p>
       <w:pPr>
-        <w:jc w:val="left"/>
-      </w:pPr>
-      <w:r>
-        <w:rPr/>
-        <w:t>ה</w:t>
-      </w:r>
-      <w:r>
-        <w:rPr/>
-        <w:t>-</w:t>
-      </w:r>
-      <w:r>
-        <w:rPr>
-          <w:rFonts w:ascii="Consolas" w:hAnsi="Consolas"/>
-          <w:color w:val="C7254E"/>
-          <w:sz w:val="18"/>
-        </w:rPr>
-        <w:t>try/catch</w:t>
-      </w:r>
-      <w:r>
-        <w:rPr/>
-        <w:t xml:space="preserve"> </w:t>
-      </w:r>
-      <w:r>
-        <w:rPr/>
-        <w:t>סביב</w:t>
-      </w:r>
-      <w:r>
-        <w:rPr/>
-        <w:t xml:space="preserve"> </w:t>
-      </w:r>
-      <w:r>
-        <w:rPr/>
-        <w:t>כל</w:t>
-      </w:r>
-      <w:r>
-        <w:rPr/>
-        <w:t xml:space="preserve"> </w:t>
-      </w:r>
-      <w:r>
-        <w:rPr/>
-        <w:t>שדה</w:t>
-      </w:r>
-      <w:r>
-        <w:rPr/>
-        <w:t xml:space="preserve"> </w:t>
-      </w:r>
-      <w:r>
-        <w:rPr/>
-        <w:t>אופציונלי</w:t>
-      </w:r>
-      <w:r>
-        <w:rPr/>
-        <w:t xml:space="preserve"> </w:t>
-      </w:r>
-      <w:r>
-        <w:rPr/>
-        <w:t>מאפשר</w:t>
-      </w:r>
-      <w:r>
-        <w:rPr/>
-        <w:t xml:space="preserve"> </w:t>
-      </w:r>
-      <w:r>
-        <w:rPr/>
-        <w:t>תאימות</w:t>
-      </w:r>
-      <w:r>
-        <w:rPr/>
-        <w:t xml:space="preserve"> </w:t>
-      </w:r>
-      <w:r>
-        <w:rPr/>
-        <w:t>אחורה</w:t>
-      </w:r>
-      <w:r>
-        <w:rPr/>
-        <w:t xml:space="preserve"> </w:t>
-      </w:r>
-      <w:r>
-        <w:rPr/>
-        <w:t>גם</w:t>
-      </w:r>
-      <w:r>
-        <w:rPr/>
-        <w:t xml:space="preserve"> </w:t>
-      </w:r>
-      <w:r>
-        <w:rPr/>
-        <w:t>אם</w:t>
-      </w:r>
-      <w:r>
-        <w:rPr/>
-        <w:t xml:space="preserve"> </w:t>
-      </w:r>
-      <w:r>
-        <w:rPr/>
-        <w:t>עמודה</w:t>
-      </w:r>
-      <w:r>
-        <w:rPr/>
-        <w:t xml:space="preserve"> </w:t>
-      </w:r>
-      <w:r>
-        <w:rPr/>
-        <w:t>חסרה</w:t>
-      </w:r>
-      <w:r>
-        <w:rPr/>
-        <w:t xml:space="preserve"> </w:t>
-      </w:r>
-      <w:r>
-        <w:rPr/>
-        <w:t>ב</w:t>
-      </w:r>
-      <w:r>
-        <w:rPr/>
-        <w:t>-Access.</w:t>
+        <w:jc w:val="right"/>
+        <w:bidi w:val="1"/>
+      </w:pPr>
+      <w:r>
+        <w:rPr>
+          <w:rtl w:val="1"/>
+        </w:rPr>
+        <w:t>עטפתי כל שדה אופציונלי ב-try/catch כי בזמן הפיתוח הוספתי עמודות לטבלאות בהדרגה, ולא רציתי שמשתמש ישן עם DB בלי העמודה החדשה יקרוס. אם השדה חסר פשוט שמים ברירת מחדל.</w:t>
       </w:r>
     </w:p>
     <w:p>
@@ -18669,335 +16631,15 @@
     </w:p>
     <w:p>
       <w:pPr>
-        <w:jc w:val="left"/>
+        <w:jc w:val="right"/>
+        <w:bidi w:val="1"/>
       </w:pPr>
       <w:r>
         <w:rPr>
           <w:b/>
-        </w:rPr>
-        <w:t>הסבר</w:t>
-      </w:r>
-      <w:r>
-        <w:rPr>
-          <w:b/>
-        </w:rPr>
-        <w:t xml:space="preserve"> </w:t>
-      </w:r>
-      <w:r>
-        <w:rPr>
-          <w:b/>
-        </w:rPr>
-        <w:t>חשוב</w:t>
-      </w:r>
-      <w:r>
-        <w:rPr>
-          <w:b/>
-        </w:rPr>
-        <w:t>:</w:t>
-      </w:r>
-      <w:r>
-        <w:rPr/>
-        <w:t xml:space="preserve"> </w:t>
-      </w:r>
-      <w:r>
-        <w:rPr/>
-        <w:t>ה</w:t>
-      </w:r>
-      <w:r>
-        <w:rPr/>
-        <w:t xml:space="preserve">-INSERT </w:t>
-      </w:r>
-      <w:r>
-        <w:rPr/>
-        <w:t>הזה</w:t>
-      </w:r>
-      <w:r>
-        <w:rPr/>
-        <w:t xml:space="preserve"> </w:t>
-      </w:r>
-      <w:r>
-        <w:rPr/>
-        <w:t>לא</w:t>
-      </w:r>
-      <w:r>
-        <w:rPr/>
-        <w:t xml:space="preserve"> </w:t>
-      </w:r>
-      <w:r>
-        <w:rPr/>
-        <w:t>משתמש</w:t>
-      </w:r>
-      <w:r>
-        <w:rPr/>
-        <w:t xml:space="preserve"> </w:t>
-      </w:r>
-      <w:r>
-        <w:rPr/>
-        <w:t>ב</w:t>
-      </w:r>
-      <w:r>
-        <w:rPr/>
-        <w:t>-</w:t>
-      </w:r>
-      <w:r>
-        <w:rPr>
-          <w:rFonts w:ascii="Consolas" w:hAnsi="Consolas"/>
-          <w:color w:val="C7254E"/>
-          <w:sz w:val="18"/>
-        </w:rPr>
-        <w:t>SaveChanges</w:t>
-      </w:r>
-      <w:r>
-        <w:rPr/>
-        <w:t xml:space="preserve"> </w:t>
-      </w:r>
-      <w:r>
-        <w:rPr/>
-        <w:t>מה</w:t>
-      </w:r>
-      <w:r>
-        <w:rPr/>
-        <w:t xml:space="preserve">-Base, </w:t>
-      </w:r>
-      <w:r>
-        <w:rPr/>
-        <w:t>מפני</w:t>
-      </w:r>
-      <w:r>
-        <w:rPr/>
-        <w:t xml:space="preserve"> </w:t>
-      </w:r>
-      <w:r>
-        <w:rPr/>
-        <w:t>שה</w:t>
-      </w:r>
-      <w:r>
-        <w:rPr/>
-        <w:t xml:space="preserve">-Base </w:t>
-      </w:r>
-      <w:r>
-        <w:rPr/>
-        <w:t>בולע</w:t>
-      </w:r>
-      <w:r>
-        <w:rPr/>
-        <w:t xml:space="preserve"> </w:t>
-      </w:r>
-      <w:r>
-        <w:rPr/>
-        <w:t>את</w:t>
-      </w:r>
-      <w:r>
-        <w:rPr/>
-        <w:t xml:space="preserve"> </w:t>
-      </w:r>
-      <w:r>
-        <w:rPr/>
-        <w:t>ה</w:t>
-      </w:r>
-      <w:r>
-        <w:rPr/>
-        <w:t>-</w:t>
-      </w:r>
-      <w:r>
-        <w:rPr>
-          <w:rFonts w:ascii="Consolas" w:hAnsi="Consolas"/>
-          <w:color w:val="C7254E"/>
-          <w:sz w:val="18"/>
-        </w:rPr>
-        <w:t>OleDbException</w:t>
-      </w:r>
-      <w:r>
-        <w:rPr/>
-        <w:t xml:space="preserve">. </w:t>
-      </w:r>
-      <w:r>
-        <w:rPr/>
-        <w:t>אנחנו</w:t>
-      </w:r>
-      <w:r>
-        <w:rPr/>
-        <w:t xml:space="preserve"> </w:t>
-      </w:r>
-      <w:r>
-        <w:rPr/>
-        <w:t>זקוקים</w:t>
-      </w:r>
-      <w:r>
-        <w:rPr/>
-        <w:t xml:space="preserve"> </w:t>
-      </w:r>
-      <w:r>
-        <w:rPr/>
-        <w:t>שהשגיאה</w:t>
-      </w:r>
-      <w:r>
-        <w:rPr/>
-        <w:t xml:space="preserve"> </w:t>
-      </w:r>
-      <w:r>
-        <w:rPr/>
-        <w:t>האמיתית</w:t>
-      </w:r>
-      <w:r>
-        <w:rPr/>
-        <w:t xml:space="preserve"> </w:t>
-      </w:r>
-      <w:r>
-        <w:rPr/>
-        <w:t>תגיע</w:t>
-      </w:r>
-      <w:r>
-        <w:rPr/>
-        <w:t xml:space="preserve"> </w:t>
-      </w:r>
-      <w:r>
-        <w:rPr/>
-        <w:t>ללקוח</w:t>
-      </w:r>
-      <w:r>
-        <w:rPr/>
-        <w:t xml:space="preserve">, </w:t>
-      </w:r>
-      <w:r>
-        <w:rPr/>
-        <w:t>ולכן</w:t>
-      </w:r>
-      <w:r>
-        <w:rPr/>
-        <w:t xml:space="preserve"> </w:t>
-      </w:r>
-      <w:r>
-        <w:rPr/>
-        <w:t>מבצעים</w:t>
-      </w:r>
-      <w:r>
-        <w:rPr/>
-        <w:t xml:space="preserve"> </w:t>
-      </w:r>
-      <w:r>
-        <w:rPr/>
-        <w:t>את</w:t>
-      </w:r>
-      <w:r>
-        <w:rPr/>
-        <w:t xml:space="preserve"> </w:t>
-      </w:r>
-      <w:r>
-        <w:rPr/>
-        <w:t>ה</w:t>
-      </w:r>
-      <w:r>
-        <w:rPr/>
-        <w:t xml:space="preserve">-INSERT </w:t>
-      </w:r>
-      <w:r>
-        <w:rPr/>
-        <w:t>ידנית</w:t>
-      </w:r>
-      <w:r>
-        <w:rPr/>
-        <w:t xml:space="preserve"> </w:t>
-      </w:r>
-      <w:r>
-        <w:rPr/>
-        <w:t>עם</w:t>
-      </w:r>
-      <w:r>
-        <w:rPr/>
-        <w:t xml:space="preserve"> </w:t>
-      </w:r>
-      <w:r>
-        <w:rPr>
-          <w:rFonts w:ascii="Consolas" w:hAnsi="Consolas"/>
-          <w:color w:val="C7254E"/>
-          <w:sz w:val="18"/>
-        </w:rPr>
-        <w:t>try/catch</w:t>
-      </w:r>
-      <w:r>
-        <w:rPr/>
-        <w:t xml:space="preserve"> </w:t>
-      </w:r>
-      <w:r>
-        <w:rPr/>
-        <w:t>ש</w:t>
-      </w:r>
-      <w:r>
-        <w:rPr/>
-        <w:t xml:space="preserve">-throw </w:t>
-      </w:r>
-      <w:r>
-        <w:rPr/>
-        <w:t>מחדש</w:t>
-      </w:r>
-      <w:r>
-        <w:rPr/>
-        <w:t xml:space="preserve"> </w:t>
-      </w:r>
-      <w:r>
-        <w:rPr/>
-        <w:t>כ</w:t>
-      </w:r>
-      <w:r>
-        <w:rPr/>
-        <w:t>-</w:t>
-      </w:r>
-      <w:r>
-        <w:rPr>
-          <w:rFonts w:ascii="Consolas" w:hAnsi="Consolas"/>
-          <w:color w:val="C7254E"/>
-          <w:sz w:val="18"/>
-        </w:rPr>
-        <w:t>InvalidOperationException</w:t>
-      </w:r>
-      <w:r>
-        <w:rPr/>
-        <w:t xml:space="preserve">. </w:t>
-      </w:r>
-      <w:r>
-        <w:rPr/>
-        <w:t>זה</w:t>
-      </w:r>
-      <w:r>
-        <w:rPr/>
-        <w:t xml:space="preserve"> </w:t>
-      </w:r>
-      <w:r>
-        <w:rPr/>
-        <w:t>מתחבר</w:t>
-      </w:r>
-      <w:r>
-        <w:rPr/>
-        <w:t xml:space="preserve"> </w:t>
-      </w:r>
-      <w:r>
-        <w:rPr/>
-        <w:t>ל</w:t>
-      </w:r>
-      <w:r>
-        <w:rPr/>
-        <w:t>-</w:t>
-      </w:r>
-      <w:r>
-        <w:rPr>
-          <w:rFonts w:ascii="Consolas" w:hAnsi="Consolas"/>
-          <w:color w:val="C7254E"/>
-          <w:sz w:val="18"/>
-        </w:rPr>
-        <w:t>FaultException</w:t>
-      </w:r>
-      <w:r>
-        <w:rPr/>
-        <w:t xml:space="preserve"> </w:t>
-      </w:r>
-      <w:r>
-        <w:rPr/>
-        <w:t>ב</w:t>
-      </w:r>
-      <w:r>
-        <w:rPr/>
-        <w:t>-Service1.</w:t>
+          <w:rtl w:val="1"/>
+        </w:rPr>
+        <w:t>כאן לא קראתי ל-SaveChanges של ה-Base כי הוא בולע את ה-OleDbException ב-catch ופשוט מחזיר 0. רציתי שאני אראה את ההודעה האמיתית, אז עשיתי INSERT ידני, וב-catch זרקתי InvalidOperationException עם ה-SQL וההודעה. ב-Service1 זה הופך ל-FaultException ומגיע ככה ללקוח.</w:t>
       </w:r>
     </w:p>
     <w:p>
@@ -22167,101 +19809,16 @@
     </w:p>
     <w:p>
       <w:pPr>
-        <w:jc w:val="left"/>
-      </w:pPr>
-      <w:r>
-        <w:rPr>
-          <w:rFonts w:ascii="Consolas" w:hAnsi="Consolas"/>
+        <w:jc w:val="right"/>
+        <w:bidi w:val="1"/>
+      </w:pPr>
+      <w:r>
+        <w:rPr>
           <w:color w:val="C7254E"/>
           <w:sz w:val="18"/>
-        </w:rPr>
-        <w:t>SlowE</w:t>
-      </w:r>
-      <w:r>
-        <w:rPr>
-          <w:rFonts w:ascii="Consolas" w:hAnsi="Consolas"/>
-          <w:color w:val="C7254E"/>
-          <w:sz w:val="18"/>
-        </w:rPr>
-        <w:t>quals</w:t>
-      </w:r>
-      <w:r>
-        <w:rPr/>
-        <w:t xml:space="preserve"> </w:t>
-      </w:r>
-      <w:r>
-        <w:rPr/>
-        <w:t>מונע</w:t>
-      </w:r>
-      <w:r>
-        <w:rPr/>
-        <w:t xml:space="preserve"> </w:t>
-      </w:r>
-      <w:r>
-        <w:rPr>
-          <w:b/>
-        </w:rPr>
-        <w:t>timing attacks</w:t>
-      </w:r>
-      <w:r>
-        <w:rPr/>
-        <w:t xml:space="preserve"> — </w:t>
-      </w:r>
-      <w:r>
-        <w:rPr/>
-        <w:t>הזמן</w:t>
-      </w:r>
-      <w:r>
-        <w:rPr/>
-        <w:t xml:space="preserve"> </w:t>
-      </w:r>
-      <w:r>
-        <w:rPr/>
-        <w:t>להשוואה</w:t>
-      </w:r>
-      <w:r>
-        <w:rPr/>
-        <w:t xml:space="preserve"> </w:t>
-      </w:r>
-      <w:r>
-        <w:rPr/>
-        <w:t>לא</w:t>
-      </w:r>
-      <w:r>
-        <w:rPr/>
-        <w:t xml:space="preserve"> </w:t>
-      </w:r>
-      <w:r>
-        <w:rPr/>
-        <w:t>תלוי</w:t>
-      </w:r>
-      <w:r>
-        <w:rPr/>
-        <w:t xml:space="preserve"> </w:t>
-      </w:r>
-      <w:r>
-        <w:rPr/>
-        <w:t>במספר</w:t>
-      </w:r>
-      <w:r>
-        <w:rPr/>
-        <w:t xml:space="preserve"> </w:t>
-      </w:r>
-      <w:r>
-        <w:rPr/>
-        <w:t>הביטים</w:t>
-      </w:r>
-      <w:r>
-        <w:rPr/>
-        <w:t xml:space="preserve"> </w:t>
-      </w:r>
-      <w:r>
-        <w:rPr/>
-        <w:t>הזהים</w:t>
-      </w:r>
-      <w:r>
-        <w:rPr/>
-        <w:t>.</w:t>
+          <w:rtl w:val="1"/>
+        </w:rPr>
+        <w:t>SlowEquals משווה את כל הבייטים תמיד, גם אם כבר ברור שיש הבדל. ככה אי אפשר ללמוד מהזמן כמה תווים נכונים — זה חוסם timing attacks.</w:t>
       </w:r>
     </w:p>
     <w:p>
@@ -24736,7 +22293,7 @@
         <w:rPr>
           <w:rtl w:val="1"/>
         </w:rPr>
-        <w:t>מנגנון זה מבטיח שכל קריאה לשרת תיסגר כראוי, גם במצב של תקלה.</w:t>
+        <w:t>עטפתי ב-ServiceGateway כדי שלא אצטרך לזכור client.Close ו-client.Abort בכל מקום. אם נופלת חריגה הוא עושה Abort, אחרת Close, וככה לא נשארים חיבורי WCF פתוחים.</w:t>
       </w:r>
     </w:p>
     <w:p>
@@ -26190,91 +23747,7 @@
         <w:rPr>
           <w:rtl w:val="1"/>
         </w:rPr>
-        <w:t>ריבוי</w:t>
-      </w:r>
-      <w:r>
-        <w:t xml:space="preserve"> </w:t>
-      </w:r>
-      <w:r>
-        <w:rPr>
-          <w:rtl w:val="1"/>
-        </w:rPr>
-        <w:t>הפורמטים</w:t>
-      </w:r>
-      <w:r>
-        <w:t xml:space="preserve"> </w:t>
-      </w:r>
-      <w:r>
-        <w:rPr>
-          <w:rtl w:val="1"/>
-        </w:rPr>
-        <w:t>נחוץ</w:t>
-      </w:r>
-      <w:r>
-        <w:t xml:space="preserve"> </w:t>
-      </w:r>
-      <w:r>
-        <w:rPr>
-          <w:rtl w:val="1"/>
-        </w:rPr>
-        <w:t>מפני</w:t>
-      </w:r>
-      <w:r>
-        <w:t xml:space="preserve"> </w:t>
-      </w:r>
-      <w:r>
-        <w:rPr>
-          <w:rtl w:val="1"/>
-        </w:rPr>
-        <w:t>שכל</w:t>
-      </w:r>
-      <w:r>
-        <w:t xml:space="preserve"> </w:t>
-      </w:r>
-      <w:r>
-        <w:rPr>
-          <w:rtl w:val="1"/>
-        </w:rPr>
-        <w:t>לקוח</w:t>
-      </w:r>
-      <w:r>
-        <w:t xml:space="preserve"> </w:t>
-      </w:r>
-      <w:r>
-        <w:rPr>
-          <w:rtl w:val="1"/>
-        </w:rPr>
-        <w:t>יכול</w:t>
-      </w:r>
-      <w:r>
-        <w:t xml:space="preserve"> </w:t>
-      </w:r>
-      <w:r>
-        <w:rPr>
-          <w:rtl w:val="1"/>
-        </w:rPr>
-        <w:t>לכתוב</w:t>
-      </w:r>
-      <w:r>
-        <w:t xml:space="preserve"> Date </w:t>
-      </w:r>
-      <w:r>
-        <w:rPr>
-          <w:rtl w:val="1"/>
-        </w:rPr>
-        <w:t>בפורמט</w:t>
-      </w:r>
-      <w:r>
-        <w:t xml:space="preserve"> </w:t>
-      </w:r>
-      <w:r>
-        <w:rPr>
-          <w:rtl w:val="1"/>
-        </w:rPr>
-        <w:t>אחר</w:t>
-      </w:r>
-      <w:r>
-        <w:t>.</w:t>
+        <w:t>הייתי חייבת רשימת פורמטים כי שמרתי Date כ-string ב-Access, וכל לקוח (WPF, Web, MAUI) כתב אותו אחרת — לפעמים yyyy-MM-dd, לפעמים dd/MM/yyyy. במקום לתקן את כולם הלוך ושוב, הפרסר מנסה את כולם בתורם.</w:t>
       </w:r>
     </w:p>
     <w:p>
@@ -29651,139 +27124,16 @@
     </w:p>
     <w:p>
       <w:pPr>
-        <w:jc w:val="left"/>
-      </w:pPr>
-      <w:r>
-        <w:rPr>
-          <w:rFonts w:ascii="Consolas" w:hAnsi="Consolas"/>
+        <w:jc w:val="right"/>
+        <w:bidi w:val="1"/>
+      </w:pPr>
+      <w:r>
+        <w:rPr>
           <w:color w:val="C7254E"/>
           <w:sz w:val="18"/>
-        </w:rPr>
-        <w:t>Shell.TabBarIsVisible="False"</w:t>
-      </w:r>
-      <w:r>
-        <w:rPr/>
-        <w:t xml:space="preserve"> </w:t>
-      </w:r>
-      <w:r>
-        <w:rPr/>
-        <w:t>חוסם</w:t>
-      </w:r>
-      <w:r>
-        <w:rPr/>
-        <w:t xml:space="preserve"> </w:t>
-      </w:r>
-      <w:r>
-        <w:rPr/>
-        <w:t>את</w:t>
-      </w:r>
-      <w:r>
-        <w:rPr/>
-        <w:t xml:space="preserve"> </w:t>
-      </w:r>
-      <w:r>
-        <w:rPr/>
-        <w:t>ה</w:t>
-      </w:r>
-      <w:r>
-        <w:rPr/>
-        <w:t xml:space="preserve">-tab bar </w:t>
-      </w:r>
-      <w:r>
-        <w:rPr/>
-        <w:t>האוטומטי</w:t>
-      </w:r>
-      <w:r>
-        <w:rPr/>
-        <w:t xml:space="preserve"> — </w:t>
-      </w:r>
-      <w:r>
-        <w:rPr/>
-        <w:t>אחרת</w:t>
-      </w:r>
-      <w:r>
-        <w:rPr/>
-        <w:t xml:space="preserve"> </w:t>
-      </w:r>
-      <w:r>
-        <w:rPr/>
-        <w:t>היו</w:t>
-      </w:r>
-      <w:r>
-        <w:rPr/>
-        <w:t xml:space="preserve"> </w:t>
-      </w:r>
-      <w:r>
-        <w:rPr/>
-        <w:t>מופיעים</w:t>
-      </w:r>
-      <w:r>
-        <w:rPr/>
-        <w:t xml:space="preserve"> </w:t>
-      </w:r>
-      <w:r>
-        <w:rPr/>
-        <w:t>כפתורי</w:t>
-      </w:r>
-      <w:r>
-        <w:rPr/>
-        <w:t xml:space="preserve"> tab </w:t>
-      </w:r>
-      <w:r>
-        <w:rPr/>
-        <w:t>של</w:t>
-      </w:r>
-      <w:r>
-        <w:rPr/>
-        <w:t xml:space="preserve"> </w:t>
-      </w:r>
-      <w:r>
-        <w:rPr/>
-        <w:t>כל</w:t>
-      </w:r>
-      <w:r>
-        <w:rPr/>
-        <w:t xml:space="preserve"> </w:t>
-      </w:r>
-      <w:r>
-        <w:rPr/>
-        <w:t>הדפים</w:t>
-      </w:r>
-      <w:r>
-        <w:rPr/>
-        <w:t xml:space="preserve"> </w:t>
-      </w:r>
-      <w:r>
-        <w:rPr/>
-        <w:t>גם</w:t>
-      </w:r>
-      <w:r>
-        <w:rPr/>
-        <w:t xml:space="preserve"> </w:t>
-      </w:r>
-      <w:r>
-        <w:rPr/>
-        <w:t>לתפקידים</w:t>
-      </w:r>
-      <w:r>
-        <w:rPr/>
-        <w:t xml:space="preserve"> </w:t>
-      </w:r>
-      <w:r>
-        <w:rPr/>
-        <w:t>לא</w:t>
-      </w:r>
-      <w:r>
-        <w:rPr/>
-        <w:t xml:space="preserve"> </w:t>
-      </w:r>
-      <w:r>
-        <w:rPr/>
-        <w:t>רלוונטיים</w:t>
-      </w:r>
-      <w:r>
-        <w:rPr/>
-        <w:t>.</w:t>
+          <w:rtl w:val="1"/>
+        </w:rPr>
+        <w:t>שמתי TabBarIsVisible="False" כי בלי זה MAUI שם אוטומטית tab bar בתחתית עם כל הדפים, גם דפים של מורה כשמחובר תלמיד. במקום זה אני מנתבת ידנית עם Shell.Current.GoToAsync.</w:t>
       </w:r>
     </w:p>
     <w:p>
@@ -34762,136 +32112,7 @@
         <w:rPr>
           <w:rtl w:val="1"/>
         </w:rPr>
-        <w:t>לפי</w:t>
-      </w:r>
-      <w:r>
-        <w:t xml:space="preserve"> </w:t>
-      </w:r>
-      <w:r>
-        <w:rPr>
-          <w:rtl w:val="1"/>
-        </w:rPr>
-        <w:t>דרישה</w:t>
-      </w:r>
-      <w:r>
-        <w:t xml:space="preserve"> </w:t>
-      </w:r>
-      <w:r>
-        <w:rPr>
-          <w:rtl w:val="1"/>
-        </w:rPr>
-        <w:t>במחוון</w:t>
-      </w:r>
-      <w:r>
-        <w:t xml:space="preserve"> </w:t>
-      </w:r>
-      <w:r>
-        <w:rPr>
-          <w:rtl w:val="1"/>
-        </w:rPr>
-        <w:t>יש</w:t>
-      </w:r>
-      <w:r>
-        <w:t xml:space="preserve"> </w:t>
-      </w:r>
-      <w:r>
-        <w:rPr>
-          <w:rtl w:val="1"/>
-        </w:rPr>
-        <w:t>להציג</w:t>
-      </w:r>
-      <w:r>
-        <w:t xml:space="preserve"> </w:t>
-      </w:r>
-      <w:r>
-        <w:rPr>
-          <w:rtl w:val="1"/>
-        </w:rPr>
-        <w:t>דו</w:t>
-      </w:r>
-      <w:r>
-        <w:t>"</w:t>
-      </w:r>
-      <w:r>
-        <w:rPr>
-          <w:rtl w:val="1"/>
-        </w:rPr>
-        <w:t>חות</w:t>
-      </w:r>
-      <w:r>
-        <w:t xml:space="preserve"> </w:t>
-      </w:r>
-      <w:r>
-        <w:rPr>
-          <w:rtl w:val="1"/>
-        </w:rPr>
-        <w:t>סטטיסטיים</w:t>
-      </w:r>
-      <w:r>
-        <w:t xml:space="preserve">. </w:t>
-      </w:r>
-      <w:r>
-        <w:rPr>
-          <w:rtl w:val="1"/>
-        </w:rPr>
-        <w:t>הפרויקט</w:t>
-      </w:r>
-      <w:r>
-        <w:t xml:space="preserve"> </w:t>
-      </w:r>
-      <w:r>
-        <w:rPr>
-          <w:rtl w:val="1"/>
-        </w:rPr>
-        <w:t>מספק</w:t>
-      </w:r>
-      <w:r>
-        <w:t xml:space="preserve"> 5 </w:t>
-      </w:r>
-      <w:r>
-        <w:rPr>
-          <w:rtl w:val="1"/>
-        </w:rPr>
-        <w:t>דפי</w:t>
-      </w:r>
-      <w:r>
-        <w:t xml:space="preserve"> </w:t>
-      </w:r>
-      <w:r>
-        <w:rPr>
-          <w:rtl w:val="1"/>
-        </w:rPr>
-        <w:t>דו</w:t>
-      </w:r>
-      <w:r>
-        <w:t>"</w:t>
-      </w:r>
-      <w:r>
-        <w:rPr>
-          <w:rtl w:val="1"/>
-        </w:rPr>
-        <w:t>חות</w:t>
-      </w:r>
-      <w:r>
-        <w:t xml:space="preserve"> </w:t>
-      </w:r>
-      <w:r>
-        <w:rPr>
-          <w:rtl w:val="1"/>
-        </w:rPr>
-        <w:t>במורה</w:t>
-      </w:r>
-      <w:r>
-        <w:t xml:space="preserve"> </w:t>
-      </w:r>
-      <w:r>
-        <w:rPr>
-          <w:rtl w:val="1"/>
-        </w:rPr>
-        <w:t>ובמנהל</w:t>
-      </w:r>
-      <w:r>
-        <w:t>:</w:t>
+        <w:t>המחוון דורש דו"חות סטטיסטיים. בניתי 5 דפי דו"חות לצד מורה/מנהל:</w:t>
       </w:r>
     </w:p>
     <w:p>
@@ -36713,7 +33934,7 @@
         <w:rPr>
           <w:rtl w:val="1"/>
         </w:rPr>
-        <w:t>הטבלה למטה מסכמת את 10 הבאגים העיקריים שטופלו במהלך הפרויקט: התופעה שזוהתה, השורש האמיתי שמצאתי בקוד (לרוב OleDbException שנבלע ב-SaveChanges הגנרי, או פורמט תאריך לא תואם בין לקוחות), הפתרון הקונקרטי שיישמתי, ורשימת הקבצים שהשתנו. קטעי קוד מלאים של התיקונים מופיעים בפרק 9 (שכבת SQL) ובפרק 15 (שכבת Notifications).</w:t>
+        <w:t>בטבלה למטה רשמתי את 10 הבאגים הכי גדולים שתיקנתי. רוב הבאגים יצאו מאותן שתי סיבות: SaveChanges של ה-Base בלע את ה-OleDbException, או שתאריך נכתב בלקוח אחד בפורמט שהלקוח השני לא ידע לפרסר. בכל שורה רשמתי מה ראיתי, מה הייתה הסיבה ומה תיקנתי. הקוד עצמו של התיקונים בפרק 9 ופרק 15.</w:t>
       </w:r>
     </w:p>
     <w:tbl>
@@ -39237,151 +36458,7 @@
         <w:rPr>
           <w:rtl w:val="1"/>
         </w:rPr>
-        <w:t>תרשים</w:t>
-      </w:r>
-      <w:r>
-        <w:t xml:space="preserve"> </w:t>
-      </w:r>
-      <w:r>
-        <w:rPr>
-          <w:rtl w:val="1"/>
-        </w:rPr>
-        <w:t>זרימה</w:t>
-      </w:r>
-      <w:r>
-        <w:t xml:space="preserve"> </w:t>
-      </w:r>
-      <w:r>
-        <w:rPr>
-          <w:rtl w:val="1"/>
-        </w:rPr>
-        <w:t>ויזואלי</w:t>
-      </w:r>
-      <w:r>
-        <w:t xml:space="preserve"> </w:t>
-      </w:r>
-      <w:r>
-        <w:rPr>
-          <w:rtl w:val="1"/>
-        </w:rPr>
-        <w:t>של</w:t>
-      </w:r>
-      <w:r>
-        <w:t xml:space="preserve"> </w:t>
-      </w:r>
-      <w:r>
-        <w:rPr>
-          <w:rtl w:val="1"/>
-        </w:rPr>
-        <w:t>כל</w:t>
-      </w:r>
-      <w:r>
-        <w:t xml:space="preserve"> </w:t>
-      </w:r>
-      <w:r>
-        <w:rPr>
-          <w:rtl w:val="1"/>
-        </w:rPr>
-        <w:t>המסכים</w:t>
-      </w:r>
-      <w:r>
-        <w:t xml:space="preserve"> </w:t>
-      </w:r>
-      <w:r>
-        <w:rPr>
-          <w:rtl w:val="1"/>
-        </w:rPr>
-        <w:t>והכפתורים</w:t>
-      </w:r>
-      <w:r>
-        <w:t xml:space="preserve"> </w:t>
-      </w:r>
-      <w:r>
-        <w:rPr>
-          <w:rtl w:val="1"/>
-        </w:rPr>
-        <w:t>בלקוח</w:t>
-      </w:r>
-      <w:r>
-        <w:t xml:space="preserve"> WPF, </w:t>
-      </w:r>
-      <w:r>
-        <w:rPr>
-          <w:rtl w:val="1"/>
-        </w:rPr>
-        <w:t>מסודר</w:t>
-      </w:r>
-      <w:r>
-        <w:t xml:space="preserve"> </w:t>
-      </w:r>
-      <w:r>
-        <w:rPr>
-          <w:rtl w:val="1"/>
-        </w:rPr>
-        <w:t>לפי</w:t>
-      </w:r>
-      <w:r>
-        <w:t xml:space="preserve"> </w:t>
-      </w:r>
-      <w:r>
-        <w:rPr>
-          <w:rtl w:val="1"/>
-        </w:rPr>
-        <w:t>אזו</w:t>
-      </w:r>
-      <w:r>
-        <w:rPr>
-          <w:rtl w:val="1"/>
-        </w:rPr>
-        <w:t>רים</w:t>
-      </w:r>
-      <w:r>
-        <w:t>: Auth (</w:t>
-      </w:r>
-      <w:r>
-        <w:rPr>
-          <w:rtl w:val="1"/>
-        </w:rPr>
-        <w:t>כחול</w:t>
-      </w:r>
-      <w:r>
-        <w:t>), Student (</w:t>
-      </w:r>
-      <w:r>
-        <w:rPr>
-          <w:rtl w:val="1"/>
-        </w:rPr>
-        <w:t>ירוק</w:t>
-      </w:r>
-      <w:r>
-        <w:t>), Teacher (</w:t>
-      </w:r>
-      <w:r>
-        <w:rPr>
-          <w:rtl w:val="1"/>
-        </w:rPr>
-        <w:t>כתום</w:t>
-      </w:r>
-      <w:r>
-        <w:t>), Admin (</w:t>
-      </w:r>
-      <w:r>
-        <w:rPr>
-          <w:rtl w:val="1"/>
-        </w:rPr>
-        <w:t>אדום</w:t>
-      </w:r>
-      <w:r>
-        <w:t>), Shared (</w:t>
-      </w:r>
-      <w:r>
-        <w:rPr>
-          <w:rtl w:val="1"/>
-        </w:rPr>
-        <w:t>אפור</w:t>
-      </w:r>
-      <w:r>
-        <w:t>).</w:t>
+        <w:t>תרשים של כל המסכים והכפתורים ב-WPF, צבעתי לפי אזורים: Auth כחול, Student ירוק, Teacher כתום, Admin אדום, Shared אפור.</w:t>
       </w:r>
     </w:p>
     <w:p>
@@ -39488,123 +36565,14 @@
     </w:p>
     <w:p>
       <w:pPr>
-        <w:jc w:val="left"/>
-      </w:pPr>
-      <w:r>
-        <w:rPr/>
-        <w:t>המסכים</w:t>
-      </w:r>
-      <w:r>
-        <w:rPr/>
-        <w:t xml:space="preserve"> </w:t>
-      </w:r>
-      <w:r>
-        <w:rPr/>
-        <w:t>בלקוח</w:t>
-      </w:r>
-      <w:r>
-        <w:rPr/>
-        <w:t xml:space="preserve"> </w:t>
-      </w:r>
-      <w:r>
-        <w:rPr/>
-        <w:t>האינטרנטי</w:t>
-      </w:r>
-      <w:r>
-        <w:rPr/>
-        <w:t xml:space="preserve"> </w:t>
-      </w:r>
-      <w:r>
-        <w:rPr/>
-        <w:t>מסודרים</w:t>
-      </w:r>
-      <w:r>
-        <w:rPr/>
-        <w:t xml:space="preserve"> </w:t>
-      </w:r>
-      <w:r>
-        <w:rPr/>
-        <w:t>לפי</w:t>
-      </w:r>
-      <w:r>
-        <w:rPr/>
-        <w:t xml:space="preserve"> </w:t>
-      </w:r>
-      <w:r>
-        <w:rPr/>
-        <w:t>תפקיד</w:t>
-      </w:r>
-      <w:r>
-        <w:rPr/>
-        <w:t xml:space="preserve">. </w:t>
-      </w:r>
-      <w:r>
-        <w:rPr/>
-        <w:t>הקווים</w:t>
-      </w:r>
-      <w:r>
-        <w:rPr/>
-        <w:t xml:space="preserve"> </w:t>
-      </w:r>
-      <w:r>
-        <w:rPr/>
-        <w:t>המקווקווים</w:t>
-      </w:r>
-      <w:r>
-        <w:rPr/>
-        <w:t xml:space="preserve"> </w:t>
-      </w:r>
-      <w:r>
-        <w:rPr/>
-        <w:t>מציינים</w:t>
-      </w:r>
-      <w:r>
-        <w:rPr/>
-        <w:t xml:space="preserve"> </w:t>
-      </w:r>
-      <w:r>
-        <w:rPr>
-          <w:rFonts w:ascii="Consolas" w:hAnsi="Consolas"/>
-          <w:color w:val="C7254E"/>
-          <w:sz w:val="18"/>
-        </w:rPr>
-        <w:t>RedirectToPage</w:t>
-      </w:r>
-      <w:r>
-        <w:rPr/>
-        <w:t xml:space="preserve"> </w:t>
-      </w:r>
-      <w:r>
-        <w:rPr/>
-        <w:t>במקרה</w:t>
-      </w:r>
-      <w:r>
-        <w:rPr/>
-        <w:t xml:space="preserve"> </w:t>
-      </w:r>
-      <w:r>
-        <w:rPr/>
-        <w:t>של</w:t>
-      </w:r>
-      <w:r>
-        <w:rPr/>
-        <w:t xml:space="preserve"> </w:t>
-      </w:r>
-      <w:r>
-        <w:rPr/>
-        <w:t>חוסר</w:t>
-      </w:r>
-      <w:r>
-        <w:rPr/>
-        <w:t xml:space="preserve"> </w:t>
-      </w:r>
-      <w:r>
-        <w:rPr/>
-        <w:t>הרשאה</w:t>
-      </w:r>
-      <w:r>
-        <w:rPr/>
-        <w:t xml:space="preserve"> (role guard).</w:t>
+        <w:jc w:val="right"/>
+        <w:bidi w:val="1"/>
+      </w:pPr>
+      <w:r>
+        <w:rPr>
+          <w:rtl w:val="1"/>
+        </w:rPr>
+        <w:t>דפי ה-Web מחולקים לפי תפקיד. קווים מקווקווים זה RedirectToPage כשמשתמש מנסה להיכנס לדף בלי הרשאה.</w:t>
       </w:r>
     </w:p>
     <w:p>
@@ -39719,159 +36687,14 @@
     </w:p>
     <w:p>
       <w:pPr>
-        <w:jc w:val="left"/>
-      </w:pPr>
-      <w:r>
-        <w:rPr/>
-        <w:t>תרשים</w:t>
-      </w:r>
-      <w:r>
-        <w:rPr/>
-        <w:t xml:space="preserve"> MAUI Shell </w:t>
-      </w:r>
-      <w:r>
-        <w:rPr/>
-        <w:t>עם</w:t>
-      </w:r>
-      <w:r>
-        <w:rPr/>
-        <w:t xml:space="preserve"> </w:t>
-      </w:r>
-      <w:r>
-        <w:rPr/>
-        <w:t>הצמתים</w:t>
-      </w:r>
-      <w:r>
-        <w:rPr/>
-        <w:t xml:space="preserve"> </w:t>
-      </w:r>
-      <w:r>
-        <w:rPr>
-          <w:rFonts w:ascii="Consolas" w:hAnsi="Consolas"/>
-          <w:color w:val="C7254E"/>
-          <w:sz w:val="18"/>
-        </w:rPr>
-        <w:t>//Login</w:t>
-      </w:r>
-      <w:r>
-        <w:rPr/>
-        <w:t xml:space="preserve">, </w:t>
-      </w:r>
-      <w:r>
-        <w:rPr>
-          <w:rFonts w:ascii="Consolas" w:hAnsi="Consolas"/>
-          <w:color w:val="C7254E"/>
-          <w:sz w:val="18"/>
-        </w:rPr>
-        <w:t>//StudentHome</w:t>
-      </w:r>
-      <w:r>
-        <w:rPr/>
-        <w:t xml:space="preserve">, </w:t>
-      </w:r>
-      <w:r>
-        <w:rPr>
-          <w:rFonts w:ascii="Consolas" w:hAnsi="Consolas"/>
-          <w:color w:val="C7254E"/>
-          <w:sz w:val="18"/>
-        </w:rPr>
-        <w:t>//TeacherHome</w:t>
-      </w:r>
-      <w:r>
-        <w:rPr/>
-        <w:t xml:space="preserve"> </w:t>
-      </w:r>
-      <w:r>
-        <w:rPr/>
-        <w:t>ועוד</w:t>
-      </w:r>
-      <w:r>
-        <w:rPr/>
-        <w:t xml:space="preserve">. </w:t>
-      </w:r>
-      <w:r>
-        <w:rPr/>
-        <w:t>הקווים</w:t>
-      </w:r>
-      <w:r>
-        <w:rPr/>
-        <w:t xml:space="preserve"> </w:t>
-      </w:r>
-      <w:r>
-        <w:rPr/>
-        <w:t>המקווקווים</w:t>
-      </w:r>
-      <w:r>
-        <w:rPr/>
-        <w:t xml:space="preserve"> </w:t>
-      </w:r>
-      <w:r>
-        <w:rPr/>
-        <w:t>מציינים</w:t>
-      </w:r>
-      <w:r>
-        <w:rPr/>
-        <w:t xml:space="preserve"> </w:t>
-      </w:r>
-      <w:r>
-        <w:rPr>
-          <w:rFonts w:ascii="Consolas" w:hAnsi="Consolas"/>
-          <w:color w:val="C7254E"/>
-          <w:sz w:val="18"/>
-        </w:rPr>
-        <w:t>RequireRoleAsync</w:t>
-      </w:r>
-      <w:r>
-        <w:rPr/>
-        <w:t xml:space="preserve"> </w:t>
-      </w:r>
-      <w:r>
-        <w:rPr/>
-        <w:t>שמנתב</w:t>
-      </w:r>
-      <w:r>
-        <w:rPr/>
-        <w:t xml:space="preserve"> </w:t>
-      </w:r>
-      <w:r>
-        <w:rPr/>
-        <w:t>משתמשים</w:t>
-      </w:r>
-      <w:r>
-        <w:rPr/>
-        <w:t xml:space="preserve"> </w:t>
-      </w:r>
-      <w:r>
-        <w:rPr/>
-        <w:t>בעלי</w:t>
-      </w:r>
-      <w:r>
-        <w:rPr/>
-        <w:t xml:space="preserve"> </w:t>
-      </w:r>
-      <w:r>
-        <w:rPr/>
-        <w:t>הרשאה</w:t>
-      </w:r>
-      <w:r>
-        <w:rPr/>
-        <w:t xml:space="preserve"> </w:t>
-      </w:r>
-      <w:r>
-        <w:rPr/>
-        <w:t>לא</w:t>
-      </w:r>
-      <w:r>
-        <w:rPr/>
-        <w:t xml:space="preserve"> </w:t>
-      </w:r>
-      <w:r>
-        <w:rPr/>
-        <w:t>מתאימה</w:t>
-      </w:r>
-      <w:r>
-        <w:rPr/>
-        <w:t>.</w:t>
+        <w:jc w:val="right"/>
+        <w:bidi w:val="1"/>
+      </w:pPr>
+      <w:r>
+        <w:rPr>
+          <w:rtl w:val="1"/>
+        </w:rPr>
+        <w:t>תרשים של ה-MAUI Shell עם הצמתים //Login, //StudentHome, //TeacherHome וכו'. קווים מקווקווים זה RequireRoleAsync שזורק החוצה משתמש עם תפקיד לא נכון.</w:t>
       </w:r>
     </w:p>
     <w:p>
@@ -40467,142 +37290,7 @@
         <w:rPr>
           <w:rtl w:val="1"/>
         </w:rPr>
-        <w:t>הפרויקט</w:t>
-      </w:r>
-      <w:r>
-        <w:t xml:space="preserve"> </w:t>
-      </w:r>
-      <w:r>
-        <w:rPr>
-          <w:rtl w:val="1"/>
-        </w:rPr>
-        <w:t>עושה</w:t>
-      </w:r>
-      <w:r>
-        <w:t xml:space="preserve"> </w:t>
-      </w:r>
-      <w:r>
-        <w:rPr>
-          <w:rtl w:val="1"/>
-        </w:rPr>
-        <w:t>שימוש</w:t>
-      </w:r>
-      <w:r>
-        <w:t xml:space="preserve"> </w:t>
-      </w:r>
-      <w:r>
-        <w:rPr>
-          <w:rtl w:val="1"/>
-        </w:rPr>
-        <w:t>מובנה</w:t>
-      </w:r>
-      <w:r>
-        <w:t xml:space="preserve"> </w:t>
-      </w:r>
-      <w:r>
-        <w:rPr>
-          <w:rtl w:val="1"/>
-        </w:rPr>
-        <w:t>ביר</w:t>
-      </w:r>
-      <w:r>
-        <w:rPr>
-          <w:rtl w:val="1"/>
-        </w:rPr>
-        <w:t>ושה</w:t>
-      </w:r>
-      <w:r>
-        <w:t xml:space="preserve"> </w:t>
-      </w:r>
-      <w:r>
-        <w:rPr>
-          <w:rtl w:val="1"/>
-        </w:rPr>
-        <w:t>לפי</w:t>
-      </w:r>
-      <w:r>
-        <w:t xml:space="preserve"> </w:t>
-      </w:r>
-      <w:r>
-        <w:rPr>
-          <w:rtl w:val="1"/>
-        </w:rPr>
-        <w:t>הנחיות</w:t>
-      </w:r>
-      <w:r>
-        <w:t xml:space="preserve"> </w:t>
-      </w:r>
-      <w:r>
-        <w:rPr>
-          <w:rtl w:val="1"/>
-        </w:rPr>
-        <w:t>סעיף</w:t>
-      </w:r>
-      <w:r>
-        <w:t xml:space="preserve"> 6 + </w:t>
-      </w:r>
-      <w:r>
-        <w:rPr>
-          <w:rtl w:val="1"/>
-        </w:rPr>
-        <w:t>הרחבת</w:t>
-      </w:r>
-      <w:r>
-        <w:t xml:space="preserve"> "</w:t>
-      </w:r>
-      <w:r>
-        <w:rPr>
-          <w:rtl w:val="1"/>
-        </w:rPr>
-        <w:t>ירושה</w:t>
-      </w:r>
-      <w:r>
-        <w:t xml:space="preserve"> </w:t>
-      </w:r>
-      <w:r>
-        <w:rPr>
-          <w:rtl w:val="1"/>
-        </w:rPr>
-        <w:t>ממחלקות</w:t>
-      </w:r>
-      <w:r>
-        <w:t xml:space="preserve"> </w:t>
-      </w:r>
-      <w:r>
-        <w:rPr>
-          <w:rtl w:val="1"/>
-        </w:rPr>
-        <w:t>שנכתבו</w:t>
-      </w:r>
-      <w:r>
-        <w:t xml:space="preserve"> </w:t>
-      </w:r>
-      <w:r>
-        <w:rPr>
-          <w:rtl w:val="1"/>
-        </w:rPr>
-        <w:t>ע</w:t>
-      </w:r>
-      <w:r>
-        <w:t>"</w:t>
-      </w:r>
-      <w:r>
-        <w:rPr>
-          <w:rtl w:val="1"/>
-        </w:rPr>
-        <w:t>י</w:t>
-      </w:r>
-      <w:r>
-        <w:t xml:space="preserve"> </w:t>
-      </w:r>
-      <w:r>
-        <w:rPr>
-          <w:rtl w:val="1"/>
-        </w:rPr>
-        <w:t>התלמיד</w:t>
-      </w:r>
-      <w:r>
-        <w:t>":</w:t>
+        <w:t>השתמשתי בירושה בכמה מקומות, גם לפי דרישת סעיף 6 וגם בהרחבה של "ירושה ממחלקות שנכתבתי בעצמי":</w:t>
       </w:r>
     </w:p>
     <w:p>
@@ -42183,139 +38871,14 @@
     </w:p>
     <w:p>
       <w:pPr>
-        <w:jc w:val="left"/>
-      </w:pPr>
-      <w:r>
-        <w:rPr/>
-        <w:t>ה</w:t>
-      </w:r>
-      <w:r>
-        <w:rPr/>
-        <w:t>-</w:t>
-      </w:r>
-      <w:r>
-        <w:rPr>
-          <w:rFonts w:ascii="Consolas" w:hAnsi="Consolas"/>
-          <w:color w:val="C7254E"/>
-          <w:sz w:val="18"/>
-        </w:rPr>
-        <w:t>DispatcherTimer</w:t>
-      </w:r>
-      <w:r>
-        <w:rPr/>
-        <w:t xml:space="preserve"> </w:t>
-      </w:r>
-      <w:r>
-        <w:rPr/>
-        <w:t>רץ</w:t>
-      </w:r>
-      <w:r>
-        <w:rPr/>
-        <w:t xml:space="preserve"> </w:t>
-      </w:r>
-      <w:r>
-        <w:rPr/>
-        <w:t>על</w:t>
-      </w:r>
-      <w:r>
-        <w:rPr/>
-        <w:t xml:space="preserve"> </w:t>
-      </w:r>
-      <w:r>
-        <w:rPr/>
-        <w:t>ה</w:t>
-      </w:r>
-      <w:r>
-        <w:rPr/>
-        <w:t xml:space="preserve">-UI thread, </w:t>
-      </w:r>
-      <w:r>
-        <w:rPr/>
-        <w:t>מאפשר</w:t>
-      </w:r>
-      <w:r>
-        <w:rPr/>
-        <w:t xml:space="preserve"> </w:t>
-      </w:r>
-      <w:r>
-        <w:rPr/>
-        <w:t>לעדכן</w:t>
-      </w:r>
-      <w:r>
-        <w:rPr/>
-        <w:t xml:space="preserve"> controls</w:t>
-      </w:r>
-      <w:r>
-        <w:rPr/>
-        <w:t xml:space="preserve"> </w:t>
-      </w:r>
-      <w:r>
-        <w:rPr/>
-        <w:t>בלי</w:t>
-      </w:r>
-      <w:r>
-        <w:rPr/>
-        <w:t xml:space="preserve"> </w:t>
-      </w:r>
-      <w:r>
-        <w:rPr>
-          <w:rFonts w:ascii="Consolas" w:hAnsi="Consolas"/>
-          <w:color w:val="C7254E"/>
-          <w:sz w:val="18"/>
-        </w:rPr>
-        <w:t>Invoke</w:t>
-      </w:r>
-      <w:r>
-        <w:rPr/>
-        <w:t xml:space="preserve">, </w:t>
-      </w:r>
-      <w:r>
-        <w:rPr/>
-        <w:t>ובכל</w:t>
-      </w:r>
-      <w:r>
-        <w:rPr/>
-        <w:t xml:space="preserve"> </w:t>
-      </w:r>
-      <w:r>
-        <w:rPr/>
-        <w:t>זאת</w:t>
-      </w:r>
-      <w:r>
-        <w:rPr/>
-        <w:t xml:space="preserve"> </w:t>
-      </w:r>
-      <w:r>
-        <w:rPr/>
-        <w:t>לא</w:t>
-      </w:r>
-      <w:r>
-        <w:rPr/>
-        <w:t xml:space="preserve"> </w:t>
-      </w:r>
-      <w:r>
-        <w:rPr/>
-        <w:t>חוסם</w:t>
-      </w:r>
-      <w:r>
-        <w:rPr/>
-        <w:t xml:space="preserve"> </w:t>
-      </w:r>
-      <w:r>
-        <w:rPr/>
-        <w:t>את</w:t>
-      </w:r>
-      <w:r>
-        <w:rPr/>
-        <w:t xml:space="preserve"> </w:t>
-      </w:r>
-      <w:r>
-        <w:rPr/>
-        <w:t>הממשק</w:t>
-      </w:r>
-      <w:r>
-        <w:rPr/>
-        <w:t>.</w:t>
+        <w:jc w:val="right"/>
+        <w:bidi w:val="1"/>
+      </w:pPr>
+      <w:r>
+        <w:rPr>
+          <w:rtl w:val="1"/>
+        </w:rPr>
+        <w:t>בחרתי ב-DispatcherTimer במקום Thread כי הוא רץ ישר על ה-UI thread, אז אני יכולה לעדכן controls בלי לעטוף ב-Dispatcher.Invoke, וזה גם לא תוקע את הממשק כי ה-tick הוא קצר.</w:t>
       </w:r>
     </w:p>
     <w:p>
@@ -42357,171 +38920,14 @@
     </w:p>
     <w:p>
       <w:pPr>
-        <w:jc w:val="left"/>
-      </w:pPr>
-      <w:r>
-        <w:rPr/>
-        <w:t>ה</w:t>
-      </w:r>
-      <w:r>
-        <w:rPr/>
-        <w:t xml:space="preserve">-Web client </w:t>
-      </w:r>
-      <w:r>
-        <w:rPr/>
-        <w:t>קורא</w:t>
-      </w:r>
-      <w:r>
-        <w:rPr/>
-        <w:t xml:space="preserve"> </w:t>
-      </w:r>
-      <w:r>
-        <w:rPr/>
-        <w:t>ל</w:t>
-      </w:r>
-      <w:r>
-        <w:rPr/>
-        <w:t xml:space="preserve">-WCF </w:t>
-      </w:r>
-      <w:r>
-        <w:rPr/>
-        <w:t>סינכרונית</w:t>
-      </w:r>
-      <w:r>
-        <w:rPr/>
-        <w:t xml:space="preserve"> </w:t>
-      </w:r>
-      <w:r>
-        <w:rPr/>
-        <w:t>כי</w:t>
-      </w:r>
-      <w:r>
-        <w:rPr/>
-        <w:t xml:space="preserve"> </w:t>
-      </w:r>
-      <w:r>
-        <w:rPr/>
-        <w:t>הבקשה</w:t>
-      </w:r>
-      <w:r>
-        <w:rPr/>
-        <w:t xml:space="preserve"> </w:t>
-      </w:r>
-      <w:r>
-        <w:rPr/>
-        <w:t>כבר</w:t>
-      </w:r>
-      <w:r>
-        <w:rPr/>
-        <w:t xml:space="preserve"> </w:t>
-      </w:r>
-      <w:r>
-        <w:rPr/>
-        <w:t>רצה</w:t>
-      </w:r>
-      <w:r>
-        <w:rPr/>
-        <w:t xml:space="preserve"> </w:t>
-      </w:r>
-      <w:r>
-        <w:rPr/>
-        <w:t>על</w:t>
-      </w:r>
-      <w:r>
-        <w:rPr/>
-        <w:t xml:space="preserve"> thread </w:t>
-      </w:r>
-      <w:r>
-        <w:rPr/>
-        <w:t>נפרד</w:t>
-      </w:r>
-      <w:r>
-        <w:rPr/>
-        <w:t xml:space="preserve"> </w:t>
-      </w:r>
-      <w:r>
-        <w:rPr/>
-        <w:t>של</w:t>
-      </w:r>
-      <w:r>
-        <w:rPr/>
-        <w:t xml:space="preserve"> ASP.NET. </w:t>
-      </w:r>
-      <w:r>
-        <w:rPr/>
-        <w:t>אם</w:t>
-      </w:r>
-      <w:r>
-        <w:rPr/>
-        <w:t xml:space="preserve"> </w:t>
-      </w:r>
-      <w:r>
-        <w:rPr/>
-        <w:t>נדרש</w:t>
-      </w:r>
-      <w:r>
-        <w:rPr/>
-        <w:t xml:space="preserve"> </w:t>
-      </w:r>
-      <w:r>
-        <w:rPr/>
-        <w:t>אסינכרוני</w:t>
-      </w:r>
-      <w:r>
-        <w:rPr/>
-        <w:t xml:space="preserve"> </w:t>
-      </w:r>
-      <w:r>
-        <w:rPr/>
-        <w:t>אפשר</w:t>
-      </w:r>
-      <w:r>
-        <w:rPr/>
-        <w:t xml:space="preserve"> </w:t>
-      </w:r>
-      <w:r>
-        <w:rPr/>
-        <w:t>להחליף</w:t>
-      </w:r>
-      <w:r>
-        <w:rPr/>
-        <w:t xml:space="preserve"> </w:t>
-      </w:r>
-      <w:r>
-        <w:rPr/>
-        <w:t>ל</w:t>
-      </w:r>
-      <w:r>
-        <w:rPr/>
-        <w:t>-</w:t>
-      </w:r>
-      <w:r>
-        <w:rPr>
-          <w:rFonts w:ascii="Consolas" w:hAnsi="Consolas"/>
-          <w:color w:val="C7254E"/>
-          <w:sz w:val="18"/>
-        </w:rPr>
-        <w:t>*Async</w:t>
-      </w:r>
-      <w:r>
-        <w:rPr/>
-        <w:t xml:space="preserve"> (</w:t>
-      </w:r>
-      <w:r>
-        <w:rPr/>
-        <w:t>קיים</w:t>
-      </w:r>
-      <w:r>
-        <w:rPr/>
-        <w:t xml:space="preserve"> </w:t>
-      </w:r>
-      <w:r>
-        <w:rPr/>
-        <w:t>ב</w:t>
-      </w:r>
-      <w:r>
-        <w:rPr/>
-        <w:t>-Reference.cs).</w:t>
+        <w:jc w:val="right"/>
+        <w:bidi w:val="1"/>
+      </w:pPr>
+      <w:r>
+        <w:rPr>
+          <w:rtl w:val="1"/>
+        </w:rPr>
+        <w:t>ב-Web השארתי קריאות סינכרוניות כי כל בקשה כבר רצה על thread נפרד של ASP.NET, אז זה לא חוסם אף אחד. אם ארצה לעבור ל-async יש כבר *Async ב-Reference.cs.</w:t>
       </w:r>
     </w:p>
     <w:p>
@@ -43729,37 +40135,7 @@
         <w:rPr>
           <w:rtl w:val="1"/>
         </w:rPr>
-        <w:t>ה</w:t>
-      </w:r>
-      <w:r>
-        <w:t>-INNER JOIN</w:t>
-      </w:r>
-      <w:r>
-        <w:rPr>
-          <w:rtl w:val="1"/>
-        </w:rPr>
-        <w:t>ים</w:t>
-      </w:r>
-      <w:r>
-        <w:t xml:space="preserve"> </w:t>
-      </w:r>
-      <w:r>
-        <w:rPr>
-          <w:rtl w:val="1"/>
-        </w:rPr>
-        <w:t>מצטיינים</w:t>
-      </w:r>
-      <w:r>
-        <w:t xml:space="preserve"> </w:t>
-      </w:r>
-      <w:r>
-        <w:rPr>
-          <w:rtl w:val="1"/>
-        </w:rPr>
-        <w:t>ב</w:t>
-      </w:r>
-      <w:r>
-        <w:t>:</w:t>
+        <w:t>השתמשתי ב-INNER JOIN בשני מקומות עיקריים:</w:t>
       </w:r>
     </w:p>
     <w:p>
@@ -43979,46 +40355,7 @@
         <w:rPr>
           <w:rtl w:val="1"/>
         </w:rPr>
-        <w:t>הפרויקט</w:t>
-      </w:r>
-      <w:r>
-        <w:t xml:space="preserve"> </w:t>
-      </w:r>
-      <w:r>
-        <w:rPr>
-          <w:rtl w:val="1"/>
-        </w:rPr>
-        <w:t>הצליח</w:t>
-      </w:r>
-      <w:r>
-        <w:t xml:space="preserve"> </w:t>
-      </w:r>
-      <w:r>
-        <w:rPr>
-          <w:rtl w:val="1"/>
-        </w:rPr>
-        <w:t>להעמיד</w:t>
-      </w:r>
-      <w:r>
-        <w:t xml:space="preserve"> </w:t>
-      </w:r>
-      <w:r>
-        <w:rPr>
-          <w:rtl w:val="1"/>
-        </w:rPr>
-        <w:t>תשתית</w:t>
-      </w:r>
-      <w:r>
-        <w:t xml:space="preserve"> </w:t>
-      </w:r>
-      <w:r>
-        <w:rPr>
-          <w:rtl w:val="1"/>
-        </w:rPr>
-        <w:t>עם</w:t>
-      </w:r>
-      <w:r>
-        <w:t>:</w:t>
+        <w:t>בסוף הצלחתי להעמיד מערכת שכוללת:</w:t>
       </w:r>
     </w:p>
     <w:p>
@@ -44031,55 +40368,7 @@
         <w:rPr>
           <w:rtl w:val="1"/>
         </w:rPr>
-        <w:t>ארכיטקטורה</w:t>
-      </w:r>
-      <w:r>
-        <w:t xml:space="preserve"> </w:t>
-      </w:r>
-      <w:r>
-        <w:rPr>
-          <w:rtl w:val="1"/>
-        </w:rPr>
-        <w:t>תלת</w:t>
-      </w:r>
-      <w:r>
-        <w:t>-</w:t>
-      </w:r>
-      <w:r>
-        <w:rPr>
-          <w:rtl w:val="1"/>
-        </w:rPr>
-        <w:t>שכבתית</w:t>
-      </w:r>
-      <w:r>
-        <w:t xml:space="preserve"> </w:t>
-      </w:r>
-      <w:r>
-        <w:rPr>
-          <w:rtl w:val="1"/>
-        </w:rPr>
-        <w:t>בשירות</w:t>
-      </w:r>
-      <w:r>
-        <w:t xml:space="preserve"> WCF + </w:t>
-      </w:r>
-      <w:r>
-        <w:rPr>
-          <w:rtl w:val="1"/>
-        </w:rPr>
-        <w:t>שלושה</w:t>
-      </w:r>
-      <w:r>
-        <w:t xml:space="preserve"> </w:t>
-      </w:r>
-      <w:r>
-        <w:rPr>
-          <w:rtl w:val="1"/>
-        </w:rPr>
-        <w:t>לקוחות</w:t>
-      </w:r>
-      <w:r>
-        <w:t xml:space="preserve"> (WPF, Web, MAUI).</w:t>
+        <w:t>שרת WCF אחד עם שלוש שכבות (Model, ViewDB, Service) + שלושה לקוחות — WPF, Web ו-MAUI.</w:t>
       </w:r>
     </w:p>
     <w:p>
@@ -44146,71 +40435,14 @@
     <w:p>
       <w:pPr>
         <w:pStyle w:val="ListBullet"/>
-        <w:jc w:val="left"/>
-      </w:pPr>
-      <w:r>
-        <w:rPr/>
-        <w:t>אבטחה</w:t>
-      </w:r>
-      <w:r>
-        <w:rPr/>
-        <w:t xml:space="preserve"> </w:t>
-      </w:r>
-      <w:r>
-        <w:rPr/>
-        <w:t>מודרנית</w:t>
-      </w:r>
-      <w:r>
-        <w:rPr/>
-        <w:t>: PBKDF2 hashing, sanitization</w:t>
-      </w:r>
-      <w:r>
-        <w:rPr/>
-        <w:t xml:space="preserve"> (</w:t>
-      </w:r>
-      <w:r>
-        <w:rPr>
-          <w:rFonts w:ascii="Consolas" w:hAnsi="Consolas"/>
-          <w:color w:val="C7254E"/>
-          <w:sz w:val="18"/>
-        </w:rPr>
-        <w:t>IsSafeString</w:t>
-      </w:r>
-      <w:r>
-        <w:rPr/>
-        <w:t xml:space="preserve">), parameterized queries, FaultException </w:t>
-      </w:r>
-      <w:r>
-        <w:rPr/>
-        <w:t>עם</w:t>
-      </w:r>
-      <w:r>
-        <w:rPr/>
-        <w:t xml:space="preserve"> </w:t>
-      </w:r>
-      <w:r>
-        <w:rPr/>
-        <w:t>הסבר</w:t>
-      </w:r>
-      <w:r>
-        <w:rPr/>
-        <w:t xml:space="preserve"> </w:t>
-      </w:r>
-      <w:r>
-        <w:rPr/>
-        <w:t>ברור</w:t>
-      </w:r>
-      <w:r>
-        <w:rPr/>
-        <w:t xml:space="preserve"> </w:t>
-      </w:r>
-      <w:r>
-        <w:rPr/>
-        <w:t>ללקוח</w:t>
-      </w:r>
-      <w:r>
-        <w:rPr/>
-        <w:t>.</w:t>
+        <w:jc w:val="right"/>
+        <w:bidi w:val="1"/>
+      </w:pPr>
+      <w:r>
+        <w:rPr>
+          <w:rtl w:val="1"/>
+        </w:rPr>
+        <w:t>אבטחה: hashing ב-PBKDF2, IsSafeString על שמות משתמש ומייל, כל שאילתת SQL פרמטרית, ו-FaultException שמחזיר ללקוח הודעה ברורה.</w:t>
       </w:r>
     </w:p>
     <w:p>
@@ -44223,64 +40455,7 @@
         <w:rPr>
           <w:rtl w:val="1"/>
         </w:rPr>
-        <w:t>חוויית</w:t>
-      </w:r>
-      <w:r>
-        <w:t xml:space="preserve"> </w:t>
-      </w:r>
-      <w:r>
-        <w:rPr>
-          <w:rtl w:val="1"/>
-        </w:rPr>
-        <w:t>משתמש</w:t>
-      </w:r>
-      <w:r>
-        <w:t xml:space="preserve"> </w:t>
-      </w:r>
-      <w:r>
-        <w:rPr>
-          <w:rtl w:val="1"/>
-        </w:rPr>
-        <w:t>שונה</w:t>
-      </w:r>
-      <w:r>
-        <w:t xml:space="preserve"> </w:t>
-      </w:r>
-      <w:r>
-        <w:rPr>
-          <w:rtl w:val="1"/>
-        </w:rPr>
-        <w:t>לכל</w:t>
-      </w:r>
-      <w:r>
-        <w:t xml:space="preserve"> </w:t>
-      </w:r>
-      <w:r>
-        <w:rPr>
-          <w:rtl w:val="1"/>
-        </w:rPr>
-        <w:t>תפקיד</w:t>
-      </w:r>
-      <w:r>
-        <w:t xml:space="preserve"> (Role-based UI) </w:t>
-      </w:r>
-      <w:r>
-        <w:rPr>
-          <w:rtl w:val="1"/>
-        </w:rPr>
-        <w:t>בכל</w:t>
-      </w:r>
-      <w:r>
-        <w:t xml:space="preserve"> </w:t>
-      </w:r>
-      <w:r>
-        <w:rPr>
-          <w:rtl w:val="1"/>
-        </w:rPr>
-        <w:t>לקוח</w:t>
-      </w:r>
-      <w:r>
-        <w:t>.</w:t>
+        <w:t>לכל תפקיד יש UI אחר בכל אחד משלושת הלקוחות — תלמיד רואה דברים שונים ממורה, ומנהל מקבל עוד דפים.</w:t>
       </w:r>
     </w:p>
     <w:p>
@@ -44293,73 +40468,7 @@
         <w:rPr>
           <w:rtl w:val="1"/>
         </w:rPr>
-        <w:t>מערכת</w:t>
-      </w:r>
-      <w:r>
-        <w:t xml:space="preserve"> </w:t>
-      </w:r>
-      <w:r>
-        <w:rPr>
-          <w:rtl w:val="1"/>
-        </w:rPr>
-        <w:t>התראות</w:t>
-      </w:r>
-      <w:r>
-        <w:t xml:space="preserve">, </w:t>
-      </w:r>
-      <w:r>
-        <w:rPr>
-          <w:rtl w:val="1"/>
-        </w:rPr>
-        <w:t>צ</w:t>
-      </w:r>
-      <w:r>
-        <w:t>'</w:t>
-      </w:r>
-      <w:r>
-        <w:rPr>
-          <w:rtl w:val="1"/>
-        </w:rPr>
-        <w:t>אט</w:t>
-      </w:r>
-      <w:r>
-        <w:t xml:space="preserve">, </w:t>
-      </w:r>
-      <w:r>
-        <w:rPr>
-          <w:rtl w:val="1"/>
-        </w:rPr>
-        <w:t>פניות</w:t>
-      </w:r>
-      <w:r>
-        <w:t xml:space="preserve"> </w:t>
-      </w:r>
-      <w:r>
-        <w:rPr>
-          <w:rtl w:val="1"/>
-        </w:rPr>
-        <w:t>תמיכה</w:t>
-      </w:r>
-      <w:r>
-        <w:t xml:space="preserve"> </w:t>
-      </w:r>
-      <w:r>
-        <w:rPr>
-          <w:rtl w:val="1"/>
-        </w:rPr>
-        <w:t>ודוחות</w:t>
-      </w:r>
-      <w:r>
-        <w:t xml:space="preserve"> </w:t>
-      </w:r>
-      <w:r>
-        <w:rPr>
-          <w:rtl w:val="1"/>
-        </w:rPr>
-        <w:t>תשלומים</w:t>
-      </w:r>
-      <w:r>
-        <w:t>.</w:t>
+        <w:t>התראות, צ'אט, פניות תמיכה ודוחות תשלומים — הכל מחובר לאותו DB.</w:t>
       </w:r>
     </w:p>
     <w:p>
@@ -44372,7 +40481,7 @@
         <w:rPr>
           <w:rtl w:val="1"/>
         </w:rPr>
-        <w:t>אבחון קל לתחזוקה: כל שגיאת SQL מגיעה ללקוח עם הודעת מפורטת בזכות שימוש ישיר ב-OleDbCommand + FaultException.</w:t>
+        <w:t>דיבוג נוח: בכל מקום שהיה לי באג ב-SQL ההודעה האמיתית הגיעה עד ללקוח, כי השתמשתי ב-OleDbCommand ישיר ועטפתי ב-FaultException במקום SaveChanges הגנרי.</w:t>
       </w:r>
     </w:p>
     <w:p>
@@ -44385,177 +40494,7 @@
           <w:b/>
           <w:rtl w:val="1"/>
         </w:rPr>
-        <w:t>מה</w:t>
-      </w:r>
-      <w:r>
-        <w:rPr>
-          <w:b/>
-        </w:rPr>
-        <w:t xml:space="preserve"> </w:t>
-      </w:r>
-      <w:r>
-        <w:rPr>
-          <w:b/>
-          <w:rtl w:val="1"/>
-        </w:rPr>
-        <w:t>היה</w:t>
-      </w:r>
-      <w:r>
-        <w:rPr>
-          <w:b/>
-        </w:rPr>
-        <w:t xml:space="preserve"> </w:t>
-      </w:r>
-      <w:r>
-        <w:rPr>
-          <w:b/>
-          <w:rtl w:val="1"/>
-        </w:rPr>
-        <w:t>אתגר</w:t>
-      </w:r>
-      <w:r>
-        <w:rPr>
-          <w:b/>
-        </w:rPr>
-        <w:t>:</w:t>
-      </w:r>
-      <w:r>
-        <w:t xml:space="preserve"> </w:t>
-      </w:r>
-      <w:r>
-        <w:rPr>
-          <w:rtl w:val="1"/>
-        </w:rPr>
-        <w:t>אכיפת</w:t>
-      </w:r>
-      <w:r>
-        <w:t xml:space="preserve"> </w:t>
-      </w:r>
-      <w:r>
-        <w:rPr>
-          <w:rtl w:val="1"/>
-        </w:rPr>
-        <w:t>תאימות</w:t>
-      </w:r>
-      <w:r>
-        <w:t xml:space="preserve"> </w:t>
-      </w:r>
-      <w:r>
-        <w:rPr>
-          <w:rtl w:val="1"/>
-        </w:rPr>
-        <w:t>בין</w:t>
-      </w:r>
-      <w:r>
-        <w:t xml:space="preserve"> </w:t>
-      </w:r>
-      <w:r>
-        <w:rPr>
-          <w:rtl w:val="1"/>
-        </w:rPr>
-        <w:t>פורמטי</w:t>
-      </w:r>
-      <w:r>
-        <w:t xml:space="preserve"> </w:t>
-      </w:r>
-      <w:r>
-        <w:rPr>
-          <w:rtl w:val="1"/>
-        </w:rPr>
-        <w:t>תאריך</w:t>
-      </w:r>
-      <w:r>
-        <w:t xml:space="preserve"> </w:t>
-      </w:r>
-      <w:r>
-        <w:rPr>
-          <w:rtl w:val="1"/>
-        </w:rPr>
-        <w:t>שונים</w:t>
-      </w:r>
-      <w:r>
-        <w:t xml:space="preserve"> (yyyy-MM-dd vs dd-MM-yyyy vs MM/dd/yyyy) </w:t>
-      </w:r>
-      <w:r>
-        <w:rPr>
-          <w:rtl w:val="1"/>
-        </w:rPr>
-        <w:t>בין</w:t>
-      </w:r>
-      <w:r>
-        <w:t xml:space="preserve"> </w:t>
-      </w:r>
-      <w:r>
-        <w:rPr>
-          <w:rtl w:val="1"/>
-        </w:rPr>
-        <w:t>שלושת</w:t>
-      </w:r>
-      <w:r>
-        <w:t xml:space="preserve"> </w:t>
-      </w:r>
-      <w:r>
-        <w:rPr>
-          <w:rtl w:val="1"/>
-        </w:rPr>
-        <w:t>הלקוחות</w:t>
-      </w:r>
-      <w:r>
-        <w:t xml:space="preserve">. </w:t>
-      </w:r>
-      <w:r>
-        <w:rPr>
-          <w:rtl w:val="1"/>
-        </w:rPr>
-        <w:t>הפתרון</w:t>
-      </w:r>
-      <w:r>
-        <w:t xml:space="preserve">: </w:t>
-      </w:r>
-      <w:r>
-        <w:rPr>
-          <w:rtl w:val="1"/>
-        </w:rPr>
-        <w:t>רשימה</w:t>
-      </w:r>
-      <w:r>
-        <w:t xml:space="preserve"> </w:t>
-      </w:r>
-      <w:r>
-        <w:rPr>
-          <w:rtl w:val="1"/>
-        </w:rPr>
-        <w:t>של</w:t>
-      </w:r>
-      <w:r>
-        <w:t xml:space="preserve"> </w:t>
-      </w:r>
-      <w:r>
-        <w:rPr>
-          <w:rtl w:val="1"/>
-        </w:rPr>
-        <w:t>פורמטים</w:t>
-      </w:r>
-      <w:r>
-        <w:t xml:space="preserve"> + </w:t>
-      </w:r>
-      <w:r>
-        <w:rPr>
-          <w:rtl w:val="1"/>
-        </w:rPr>
-        <w:t>פולבק</w:t>
-      </w:r>
-      <w:r>
-        <w:t xml:space="preserve"> </w:t>
-      </w:r>
-      <w:r>
-        <w:rPr>
-          <w:rtl w:val="1"/>
-        </w:rPr>
-        <w:t>ל</w:t>
-      </w:r>
-      <w:r>
-        <w:t>-InvariantCulture.</w:t>
+        <w:t>מה היה הכי קשה: התאריכים. שמרתי Date כ-string ב-Access, וכל לקוח כתב אותו אחרת. בהתחלה ניסיתי להכריח את כולם לכתוב yyyy-MM-dd, אבל זה לא החזיק, אז בסוף עשיתי TryParseExact עם רשימת פורמטים + fallback ל-InvariantCulture.</w:t>
       </w:r>
     </w:p>
     <w:p>
@@ -44568,236 +40507,7 @@
           <w:b/>
           <w:rtl w:val="1"/>
         </w:rPr>
-        <w:t>מה</w:t>
-      </w:r>
-      <w:r>
-        <w:rPr>
-          <w:b/>
-        </w:rPr>
-        <w:t xml:space="preserve"> </w:t>
-      </w:r>
-      <w:r>
-        <w:rPr>
-          <w:b/>
-          <w:rtl w:val="1"/>
-        </w:rPr>
-        <w:t>למדתי</w:t>
-      </w:r>
-      <w:r>
-        <w:rPr>
-          <w:b/>
-        </w:rPr>
-        <w:t>:</w:t>
-      </w:r>
-      <w:r>
-        <w:t xml:space="preserve"> </w:t>
-      </w:r>
-      <w:r>
-        <w:rPr>
-          <w:rtl w:val="1"/>
-        </w:rPr>
-        <w:t>שאם</w:t>
-      </w:r>
-      <w:r>
-        <w:t xml:space="preserve"> </w:t>
-      </w:r>
-      <w:r>
-        <w:rPr>
-          <w:rtl w:val="1"/>
-        </w:rPr>
-        <w:t>שכבת</w:t>
-      </w:r>
-      <w:r>
-        <w:t xml:space="preserve"> DB </w:t>
-      </w:r>
-      <w:r>
-        <w:rPr>
-          <w:rtl w:val="1"/>
-        </w:rPr>
-        <w:t>בולעת</w:t>
-      </w:r>
-      <w:r>
-        <w:t xml:space="preserve"> </w:t>
-      </w:r>
-      <w:r>
-        <w:rPr>
-          <w:rtl w:val="1"/>
-        </w:rPr>
-        <w:t>שגיאות</w:t>
-      </w:r>
-      <w:r>
-        <w:t xml:space="preserve">, </w:t>
-      </w:r>
-      <w:r>
-        <w:rPr>
-          <w:rtl w:val="1"/>
-        </w:rPr>
-        <w:t>באגים</w:t>
-      </w:r>
-      <w:r>
-        <w:t xml:space="preserve"> </w:t>
-      </w:r>
-      <w:r>
-        <w:rPr>
-          <w:rtl w:val="1"/>
-        </w:rPr>
-        <w:t>הופכים</w:t>
-      </w:r>
-      <w:r>
-        <w:t xml:space="preserve"> </w:t>
-      </w:r>
-      <w:r>
-        <w:rPr>
-          <w:rtl w:val="1"/>
-        </w:rPr>
-        <w:t>בלתי</w:t>
-      </w:r>
-      <w:r>
-        <w:t>-</w:t>
-      </w:r>
-      <w:r>
-        <w:rPr>
-          <w:rtl w:val="1"/>
-        </w:rPr>
-        <w:t>נראים</w:t>
-      </w:r>
-      <w:r>
-        <w:t xml:space="preserve">. </w:t>
-      </w:r>
-      <w:r>
-        <w:rPr>
-          <w:rtl w:val="1"/>
-        </w:rPr>
-        <w:t>צריך</w:t>
-      </w:r>
-      <w:r>
-        <w:t xml:space="preserve"> </w:t>
-      </w:r>
-      <w:r>
-        <w:rPr>
-          <w:rtl w:val="1"/>
-        </w:rPr>
-        <w:t>לאפשר</w:t>
-      </w:r>
-      <w:r>
-        <w:t xml:space="preserve"> </w:t>
-      </w:r>
-      <w:r>
-        <w:rPr>
-          <w:rtl w:val="1"/>
-        </w:rPr>
-        <w:t>ל</w:t>
-      </w:r>
-      <w:r>
-        <w:t xml:space="preserve">-OleDbException </w:t>
-      </w:r>
-      <w:r>
-        <w:rPr>
-          <w:rtl w:val="1"/>
-        </w:rPr>
-        <w:t>להגיע</w:t>
-      </w:r>
-      <w:r>
-        <w:t xml:space="preserve"> </w:t>
-      </w:r>
-      <w:r>
-        <w:rPr>
-          <w:rtl w:val="1"/>
-        </w:rPr>
-        <w:t>ללקוח</w:t>
-      </w:r>
-      <w:r>
-        <w:t xml:space="preserve"> (</w:t>
-      </w:r>
-      <w:r>
-        <w:rPr>
-          <w:rtl w:val="1"/>
-        </w:rPr>
-        <w:t>גם</w:t>
-      </w:r>
-      <w:r>
-        <w:t xml:space="preserve"> </w:t>
-      </w:r>
-      <w:r>
-        <w:rPr>
-          <w:rtl w:val="1"/>
-        </w:rPr>
-        <w:t>אם</w:t>
-      </w:r>
-      <w:r>
-        <w:t xml:space="preserve"> </w:t>
-      </w:r>
-      <w:r>
-        <w:rPr>
-          <w:rtl w:val="1"/>
-        </w:rPr>
-        <w:t>רק</w:t>
-      </w:r>
-      <w:r>
-        <w:t xml:space="preserve"> </w:t>
-      </w:r>
-      <w:r>
-        <w:rPr>
-          <w:rtl w:val="1"/>
-        </w:rPr>
-        <w:t>בסביבת</w:t>
-      </w:r>
-      <w:r>
-        <w:t xml:space="preserve"> </w:t>
-      </w:r>
-      <w:r>
-        <w:rPr>
-          <w:rtl w:val="1"/>
-        </w:rPr>
-        <w:t>פיתוח</w:t>
-      </w:r>
-      <w:r>
-        <w:t xml:space="preserve">) </w:t>
-      </w:r>
-      <w:r>
-        <w:rPr>
-          <w:rtl w:val="1"/>
-        </w:rPr>
-        <w:t>כדי</w:t>
-      </w:r>
-      <w:r>
-        <w:t xml:space="preserve"> </w:t>
-      </w:r>
-      <w:r>
-        <w:rPr>
-          <w:rtl w:val="1"/>
-        </w:rPr>
-        <w:t>לראות</w:t>
-      </w:r>
-      <w:r>
-        <w:t xml:space="preserve"> </w:t>
-      </w:r>
-      <w:r>
-        <w:rPr>
-          <w:rtl w:val="1"/>
-        </w:rPr>
-        <w:t>את</w:t>
-      </w:r>
-      <w:r>
-        <w:t xml:space="preserve"> </w:t>
-      </w:r>
-      <w:r>
-        <w:rPr>
-          <w:rtl w:val="1"/>
-        </w:rPr>
-        <w:t>הבעיה</w:t>
-      </w:r>
-      <w:r>
-        <w:t xml:space="preserve"> </w:t>
-      </w:r>
-      <w:r>
-        <w:rPr>
-          <w:rtl w:val="1"/>
-        </w:rPr>
-        <w:t>האמיתית</w:t>
-      </w:r>
-      <w:r>
-        <w:t>.</w:t>
+        <w:t>מה למדתי: שכבת DB שבולעת שגיאות זה הדבר הכי גרוע. ישבתי שעות על באג שבסוף הסתבר שהיה רק עמודה חסרה, ולא ראיתי כלום כי ה-catch סתם עשה return 0. מאז אני תמיד מחזירה את השגיאה למעלה, לפחות בזמן פיתוח.</w:t>
       </w:r>
     </w:p>
     <w:p>
@@ -44810,26 +40520,7 @@
           <w:b/>
           <w:rtl w:val="1"/>
         </w:rPr>
-        <w:t>הרחבות</w:t>
-      </w:r>
-      <w:r>
-        <w:rPr>
-          <w:b/>
-        </w:rPr>
-        <w:t xml:space="preserve"> </w:t>
-      </w:r>
-      <w:r>
-        <w:rPr>
-          <w:b/>
-          <w:rtl w:val="1"/>
-        </w:rPr>
-        <w:t>עתידיות</w:t>
-      </w:r>
-      <w:r>
-        <w:rPr>
-          <w:b/>
-        </w:rPr>
-        <w:t>:</w:t>
+        <w:t>דברים שהייתי רוצה להוסיף אחר כך:</w:t>
       </w:r>
     </w:p>
     <w:p>

</xml_diff>

<commit_message>
docs: switch first-person voice from feminine to masculine
Fix gender mismatch in the rewritten paragraphs: change feminine first-person
forms to masculine — אני עוברת → אני עובר, הייתי חייבת → הייתי חייב,
אני מנתבת → אני מנתב, אני יכולה → אני יכול, אני מחזירה → אני מחזיר.

(§108 'השיטה בודקת' kept as-is: 'שיטה' is grammatically feminine.)
</commit_message>
<xml_diff>
--- a/ספר_פרויקט_Driver_Moodle_FINAL_v3.docx
+++ b/ספר_פרויקט_Driver_Moodle_FINAL_v3.docx
@@ -2501,7 +2501,7 @@
           <w:color w:val="555555"/>
           <w:rtl w:val="1"/>
         </w:rPr>
-        <w:t>בפרק הזה אני עוברת על המחוון סעיף-סעיף ומראה איפה כל דרישה ממומשת בקוד (קובץ ושורה), עם הפנייה לפרק שבו זה מוסבר במלואו.</w:t>
+        <w:t>בפרק הזה אני עובר על המחוון סעיף-סעיף ומראה איפה כל דרישה ממומשת בקוד (קובץ ושורה), עם הפנייה לפרק שבו זה מוסבר במלואו.</w:t>
       </w:r>
     </w:p>
     <w:p>
@@ -23747,7 +23747,7 @@
         <w:rPr>
           <w:rtl w:val="1"/>
         </w:rPr>
-        <w:t>הייתי חייבת רשימת פורמטים כי שמרתי Date כ-string ב-Access, וכל לקוח (WPF, Web, MAUI) כתב אותו אחרת — לפעמים yyyy-MM-dd, לפעמים dd/MM/yyyy. במקום לתקן את כולם הלוך ושוב, הפרסר מנסה את כולם בתורם.</w:t>
+        <w:t>הייתי חייב רשימת פורמטים כי שמרתי Date כ-string ב-Access, וכל לקוח (WPF, Web, MAUI) כתב אותו אחרת — לפעמים yyyy-MM-dd, לפעמים dd/MM/yyyy. במקום לתקן את כולם הלוך ושוב, הפרסר מנסה את כולם בתורם.</w:t>
       </w:r>
     </w:p>
     <w:p>
@@ -27133,7 +27133,7 @@
           <w:sz w:val="18"/>
           <w:rtl w:val="1"/>
         </w:rPr>
-        <w:t>שמתי TabBarIsVisible="False" כי בלי זה MAUI שם אוטומטית tab bar בתחתית עם כל הדפים, גם דפים של מורה כשמחובר תלמיד. במקום זה אני מנתבת ידנית עם Shell.Current.GoToAsync.</w:t>
+        <w:t>שמתי TabBarIsVisible="False" כי בלי זה MAUI שם אוטומטית tab bar בתחתית עם כל הדפים, גם דפים של מורה כשמחובר תלמיד. במקום זה אני מנתב ידנית עם Shell.Current.GoToAsync.</w:t>
       </w:r>
     </w:p>
     <w:p>
@@ -38878,7 +38878,7 @@
         <w:rPr>
           <w:rtl w:val="1"/>
         </w:rPr>
-        <w:t>בחרתי ב-DispatcherTimer במקום Thread כי הוא רץ ישר על ה-UI thread, אז אני יכולה לעדכן controls בלי לעטוף ב-Dispatcher.Invoke, וזה גם לא תוקע את הממשק כי ה-tick הוא קצר.</w:t>
+        <w:t>בחרתי ב-DispatcherTimer במקום Thread כי הוא רץ ישר על ה-UI thread, אז אני יכול לעדכן controls בלי לעטוף ב-Dispatcher.Invoke, וזה גם לא תוקע את הממשק כי ה-tick הוא קצר.</w:t>
       </w:r>
     </w:p>
     <w:p>
@@ -40507,7 +40507,7 @@
           <w:b/>
           <w:rtl w:val="1"/>
         </w:rPr>
-        <w:t>מה למדתי: שכבת DB שבולעת שגיאות זה הדבר הכי גרוע. ישבתי שעות על באג שבסוף הסתבר שהיה רק עמודה חסרה, ולא ראיתי כלום כי ה-catch סתם עשה return 0. מאז אני תמיד מחזירה את השגיאה למעלה, לפחות בזמן פיתוח.</w:t>
+        <w:t>מה למדתי: שכבת DB שבולעת שגיאות זה הדבר הכי גרוע. ישבתי שעות על באג שבסוף הסתבר שהיה רק עמודה חסרה, ולא ראיתי כלום כי ה-catch סתם עשה return 0. מאז אני תמיד מחזיר את השגיאה למעלה, לפחות בזמן פיתוח.</w:t>
       </w:r>
     </w:p>
     <w:p>

</xml_diff>